<commit_message>
docs(informe): portada APA con asignatura, texto de SonarCloud neutral y checklist actualizado
- Portada: asignatura 'Arquitectura de Software'; se quita el marcador del docente
- SonarCloud: los malos olores pasan a ser hallazgos de revisión manual hasta que exista el análisis
- CAPTURAS_PENDIENTES.md: estado al 15/10 (10 capturas pendientes)
- .gitignore: excluye capturas/_descartadas/

Co-Authored-By: Claude Opus 5.5 <noreply@anthropic.com>
</commit_message>
<xml_diff>
--- a/Sexto_Semestre/Arqui_Software/taller_arqui_nube/taller-arquitectura/informe/Informe_Taller_Arquitectura.docx
+++ b/Sexto_Semestre/Arqui_Software/taller_arqui_nube/taller-arquitectura/informe/Informe_Taller_Arquitectura.docx
@@ -38,21 +38,7 @@
         <w:jc w:val="center"/>
       </w:pPr>
       <w:r>
-        <w:rPr>
-          <w:highlight w:val="yellow"/>
-        </w:rPr>
-        <w:t>[ASIGNATURA]</w:t>
-      </w:r>
-    </w:p>
-    <w:p>
-      <w:pPr>
-        <w:jc w:val="center"/>
-      </w:pPr>
-      <w:r>
-        <w:rPr>
-          <w:highlight w:val="yellow"/>
-        </w:rPr>
-        <w:t>[DOCENTE]</w:t>
+        <w:t>Arquitectura de Software</w:t>
       </w:r>
     </w:p>
     <w:p>
@@ -99,7 +85,7 @@
       <w:r>
         <w:fldChar w:fldCharType="separate"/>
       </w:r>
-      <w:hyperlink w:anchor="_Toc242792284" w:history="1">
+      <w:hyperlink w:anchor="_Toc242961179" w:history="1">
         <w:r>
           <w:rPr>
             <w:rStyle w:val="Hipervnculo"/>
@@ -126,7 +112,7 @@
             <w:noProof/>
             <w:webHidden/>
           </w:rPr>
-          <w:instrText xml:space="preserve"> PAGEREF _Toc242792284 \h </w:instrText>
+          <w:instrText xml:space="preserve"> PAGEREF _Toc242961179 \h </w:instrText>
         </w:r>
         <w:r>
           <w:rPr>
@@ -167,7 +153,7 @@
           <w:noProof/>
         </w:rPr>
       </w:pPr>
-      <w:hyperlink w:anchor="_Toc242792285" w:history="1">
+      <w:hyperlink w:anchor="_Toc242961180" w:history="1">
         <w:r>
           <w:rPr>
             <w:rStyle w:val="Hipervnculo"/>
@@ -194,7 +180,7 @@
             <w:noProof/>
             <w:webHidden/>
           </w:rPr>
-          <w:instrText xml:space="preserve"> PAGEREF _Toc242792285 \h </w:instrText>
+          <w:instrText xml:space="preserve"> PAGEREF _Toc242961180 \h </w:instrText>
         </w:r>
         <w:r>
           <w:rPr>
@@ -235,7 +221,7 @@
           <w:noProof/>
         </w:rPr>
       </w:pPr>
-      <w:hyperlink w:anchor="_Toc242792286" w:history="1">
+      <w:hyperlink w:anchor="_Toc242961181" w:history="1">
         <w:r>
           <w:rPr>
             <w:rStyle w:val="Hipervnculo"/>
@@ -262,7 +248,7 @@
             <w:noProof/>
             <w:webHidden/>
           </w:rPr>
-          <w:instrText xml:space="preserve"> PAGEREF _Toc242792286 \h </w:instrText>
+          <w:instrText xml:space="preserve"> PAGEREF _Toc242961181 \h </w:instrText>
         </w:r>
         <w:r>
           <w:rPr>
@@ -303,7 +289,7 @@
           <w:noProof/>
         </w:rPr>
       </w:pPr>
-      <w:hyperlink w:anchor="_Toc242792287" w:history="1">
+      <w:hyperlink w:anchor="_Toc242961182" w:history="1">
         <w:r>
           <w:rPr>
             <w:rStyle w:val="Hipervnculo"/>
@@ -330,7 +316,7 @@
             <w:noProof/>
             <w:webHidden/>
           </w:rPr>
-          <w:instrText xml:space="preserve"> PAGEREF _Toc242792287 \h </w:instrText>
+          <w:instrText xml:space="preserve"> PAGEREF _Toc242961182 \h </w:instrText>
         </w:r>
         <w:r>
           <w:rPr>
@@ -371,7 +357,7 @@
           <w:noProof/>
         </w:rPr>
       </w:pPr>
-      <w:hyperlink w:anchor="_Toc242792288" w:history="1">
+      <w:hyperlink w:anchor="_Toc242961183" w:history="1">
         <w:r>
           <w:rPr>
             <w:rStyle w:val="Hipervnculo"/>
@@ -398,7 +384,7 @@
             <w:noProof/>
             <w:webHidden/>
           </w:rPr>
-          <w:instrText xml:space="preserve"> PAGEREF _Toc242792288 \h </w:instrText>
+          <w:instrText xml:space="preserve"> PAGEREF _Toc242961183 \h </w:instrText>
         </w:r>
         <w:r>
           <w:rPr>
@@ -439,7 +425,7 @@
           <w:noProof/>
         </w:rPr>
       </w:pPr>
-      <w:hyperlink w:anchor="_Toc242792289" w:history="1">
+      <w:hyperlink w:anchor="_Toc242961184" w:history="1">
         <w:r>
           <w:rPr>
             <w:rStyle w:val="Hipervnculo"/>
@@ -466,7 +452,7 @@
             <w:noProof/>
             <w:webHidden/>
           </w:rPr>
-          <w:instrText xml:space="preserve"> PAGEREF _Toc242792289 \h </w:instrText>
+          <w:instrText xml:space="preserve"> PAGEREF _Toc242961184 \h </w:instrText>
         </w:r>
         <w:r>
           <w:rPr>
@@ -507,7 +493,7 @@
           <w:noProof/>
         </w:rPr>
       </w:pPr>
-      <w:hyperlink w:anchor="_Toc242792290" w:history="1">
+      <w:hyperlink w:anchor="_Toc242961185" w:history="1">
         <w:r>
           <w:rPr>
             <w:rStyle w:val="Hipervnculo"/>
@@ -534,7 +520,7 @@
             <w:noProof/>
             <w:webHidden/>
           </w:rPr>
-          <w:instrText xml:space="preserve"> PAGEREF _Toc242792290 \h </w:instrText>
+          <w:instrText xml:space="preserve"> PAGEREF _Toc242961185 \h </w:instrText>
         </w:r>
         <w:r>
           <w:rPr>
@@ -575,7 +561,7 @@
           <w:noProof/>
         </w:rPr>
       </w:pPr>
-      <w:hyperlink w:anchor="_Toc242792291" w:history="1">
+      <w:hyperlink w:anchor="_Toc242961186" w:history="1">
         <w:r>
           <w:rPr>
             <w:rStyle w:val="Hipervnculo"/>
@@ -602,7 +588,7 @@
             <w:noProof/>
             <w:webHidden/>
           </w:rPr>
-          <w:instrText xml:space="preserve"> PAGEREF _Toc242792291 \h </w:instrText>
+          <w:instrText xml:space="preserve"> PAGEREF _Toc242961186 \h </w:instrText>
         </w:r>
         <w:r>
           <w:rPr>
@@ -643,7 +629,7 @@
           <w:noProof/>
         </w:rPr>
       </w:pPr>
-      <w:hyperlink w:anchor="_Toc242792292" w:history="1">
+      <w:hyperlink w:anchor="_Toc242961187" w:history="1">
         <w:r>
           <w:rPr>
             <w:rStyle w:val="Hipervnculo"/>
@@ -670,7 +656,7 @@
             <w:noProof/>
             <w:webHidden/>
           </w:rPr>
-          <w:instrText xml:space="preserve"> PAGEREF _Toc242792292 \h </w:instrText>
+          <w:instrText xml:space="preserve"> PAGEREF _Toc242961187 \h </w:instrText>
         </w:r>
         <w:r>
           <w:rPr>
@@ -711,7 +697,7 @@
           <w:noProof/>
         </w:rPr>
       </w:pPr>
-      <w:hyperlink w:anchor="_Toc242792293" w:history="1">
+      <w:hyperlink w:anchor="_Toc242961188" w:history="1">
         <w:r>
           <w:rPr>
             <w:rStyle w:val="Hipervnculo"/>
@@ -738,7 +724,7 @@
             <w:noProof/>
             <w:webHidden/>
           </w:rPr>
-          <w:instrText xml:space="preserve"> PAGEREF _Toc242792293 \h </w:instrText>
+          <w:instrText xml:space="preserve"> PAGEREF _Toc242961188 \h </w:instrText>
         </w:r>
         <w:r>
           <w:rPr>
@@ -779,7 +765,7 @@
           <w:noProof/>
         </w:rPr>
       </w:pPr>
-      <w:hyperlink w:anchor="_Toc242792294" w:history="1">
+      <w:hyperlink w:anchor="_Toc242961189" w:history="1">
         <w:r>
           <w:rPr>
             <w:rStyle w:val="Hipervnculo"/>
@@ -806,7 +792,7 @@
             <w:noProof/>
             <w:webHidden/>
           </w:rPr>
-          <w:instrText xml:space="preserve"> PAGEREF _Toc242792294 \h </w:instrText>
+          <w:instrText xml:space="preserve"> PAGEREF _Toc242961189 \h </w:instrText>
         </w:r>
         <w:r>
           <w:rPr>
@@ -847,7 +833,7 @@
           <w:noProof/>
         </w:rPr>
       </w:pPr>
-      <w:hyperlink w:anchor="_Toc242792295" w:history="1">
+      <w:hyperlink w:anchor="_Toc242961190" w:history="1">
         <w:r>
           <w:rPr>
             <w:rStyle w:val="Hipervnculo"/>
@@ -874,7 +860,7 @@
             <w:noProof/>
             <w:webHidden/>
           </w:rPr>
-          <w:instrText xml:space="preserve"> PAGEREF _Toc242792295 \h </w:instrText>
+          <w:instrText xml:space="preserve"> PAGEREF _Toc242961190 \h </w:instrText>
         </w:r>
         <w:r>
           <w:rPr>
@@ -915,7 +901,7 @@
           <w:noProof/>
         </w:rPr>
       </w:pPr>
-      <w:hyperlink w:anchor="_Toc242792296" w:history="1">
+      <w:hyperlink w:anchor="_Toc242961191" w:history="1">
         <w:r>
           <w:rPr>
             <w:rStyle w:val="Hipervnculo"/>
@@ -942,7 +928,7 @@
             <w:noProof/>
             <w:webHidden/>
           </w:rPr>
-          <w:instrText xml:space="preserve"> PAGEREF _Toc242792296 \h </w:instrText>
+          <w:instrText xml:space="preserve"> PAGEREF _Toc242961191 \h </w:instrText>
         </w:r>
         <w:r>
           <w:rPr>
@@ -983,7 +969,7 @@
           <w:noProof/>
         </w:rPr>
       </w:pPr>
-      <w:hyperlink w:anchor="_Toc242792297" w:history="1">
+      <w:hyperlink w:anchor="_Toc242961192" w:history="1">
         <w:r>
           <w:rPr>
             <w:rStyle w:val="Hipervnculo"/>
@@ -1010,7 +996,7 @@
             <w:noProof/>
             <w:webHidden/>
           </w:rPr>
-          <w:instrText xml:space="preserve"> PAGEREF _Toc242792297 \h </w:instrText>
+          <w:instrText xml:space="preserve"> PAGEREF _Toc242961192 \h </w:instrText>
         </w:r>
         <w:r>
           <w:rPr>
@@ -1051,7 +1037,7 @@
           <w:noProof/>
         </w:rPr>
       </w:pPr>
-      <w:hyperlink w:anchor="_Toc242792298" w:history="1">
+      <w:hyperlink w:anchor="_Toc242961193" w:history="1">
         <w:r>
           <w:rPr>
             <w:rStyle w:val="Hipervnculo"/>
@@ -1078,7 +1064,7 @@
             <w:noProof/>
             <w:webHidden/>
           </w:rPr>
-          <w:instrText xml:space="preserve"> PAGEREF _Toc242792298 \h </w:instrText>
+          <w:instrText xml:space="preserve"> PAGEREF _Toc242961193 \h </w:instrText>
         </w:r>
         <w:r>
           <w:rPr>
@@ -1119,7 +1105,7 @@
           <w:noProof/>
         </w:rPr>
       </w:pPr>
-      <w:hyperlink w:anchor="_Toc242792299" w:history="1">
+      <w:hyperlink w:anchor="_Toc242961194" w:history="1">
         <w:r>
           <w:rPr>
             <w:rStyle w:val="Hipervnculo"/>
@@ -1146,7 +1132,7 @@
             <w:noProof/>
             <w:webHidden/>
           </w:rPr>
-          <w:instrText xml:space="preserve"> PAGEREF _Toc242792299 \h </w:instrText>
+          <w:instrText xml:space="preserve"> PAGEREF _Toc242961194 \h </w:instrText>
         </w:r>
         <w:r>
           <w:rPr>
@@ -1187,7 +1173,7 @@
           <w:noProof/>
         </w:rPr>
       </w:pPr>
-      <w:hyperlink w:anchor="_Toc242792300" w:history="1">
+      <w:hyperlink w:anchor="_Toc242961195" w:history="1">
         <w:r>
           <w:rPr>
             <w:rStyle w:val="Hipervnculo"/>
@@ -1214,7 +1200,7 @@
             <w:noProof/>
             <w:webHidden/>
           </w:rPr>
-          <w:instrText xml:space="preserve"> PAGEREF _Toc242792300 \h </w:instrText>
+          <w:instrText xml:space="preserve"> PAGEREF _Toc242961195 \h </w:instrText>
         </w:r>
         <w:r>
           <w:rPr>
@@ -1255,7 +1241,7 @@
           <w:noProof/>
         </w:rPr>
       </w:pPr>
-      <w:hyperlink w:anchor="_Toc242792301" w:history="1">
+      <w:hyperlink w:anchor="_Toc242961196" w:history="1">
         <w:r>
           <w:rPr>
             <w:rStyle w:val="Hipervnculo"/>
@@ -1282,7 +1268,7 @@
             <w:noProof/>
             <w:webHidden/>
           </w:rPr>
-          <w:instrText xml:space="preserve"> PAGEREF _Toc242792301 \h </w:instrText>
+          <w:instrText xml:space="preserve"> PAGEREF _Toc242961196 \h </w:instrText>
         </w:r>
         <w:r>
           <w:rPr>
@@ -1323,7 +1309,7 @@
           <w:noProof/>
         </w:rPr>
       </w:pPr>
-      <w:hyperlink w:anchor="_Toc242792302" w:history="1">
+      <w:hyperlink w:anchor="_Toc242961197" w:history="1">
         <w:r>
           <w:rPr>
             <w:rStyle w:val="Hipervnculo"/>
@@ -1350,7 +1336,7 @@
             <w:noProof/>
             <w:webHidden/>
           </w:rPr>
-          <w:instrText xml:space="preserve"> PAGEREF _Toc242792302 \h </w:instrText>
+          <w:instrText xml:space="preserve"> PAGEREF _Toc242961197 \h </w:instrText>
         </w:r>
         <w:r>
           <w:rPr>
@@ -1391,7 +1377,7 @@
           <w:noProof/>
         </w:rPr>
       </w:pPr>
-      <w:hyperlink w:anchor="_Toc242792303" w:history="1">
+      <w:hyperlink w:anchor="_Toc242961198" w:history="1">
         <w:r>
           <w:rPr>
             <w:rStyle w:val="Hipervnculo"/>
@@ -1418,7 +1404,7 @@
             <w:noProof/>
             <w:webHidden/>
           </w:rPr>
-          <w:instrText xml:space="preserve"> PAGEREF _Toc242792303 \h </w:instrText>
+          <w:instrText xml:space="preserve"> PAGEREF _Toc242961198 \h </w:instrText>
         </w:r>
         <w:r>
           <w:rPr>
@@ -1459,7 +1445,7 @@
           <w:noProof/>
         </w:rPr>
       </w:pPr>
-      <w:hyperlink w:anchor="_Toc242792304" w:history="1">
+      <w:hyperlink w:anchor="_Toc242961199" w:history="1">
         <w:r>
           <w:rPr>
             <w:rStyle w:val="Hipervnculo"/>
@@ -1486,7 +1472,7 @@
             <w:noProof/>
             <w:webHidden/>
           </w:rPr>
-          <w:instrText xml:space="preserve"> PAGEREF _Toc242792304 \h </w:instrText>
+          <w:instrText xml:space="preserve"> PAGEREF _Toc242961199 \h </w:instrText>
         </w:r>
         <w:r>
           <w:rPr>
@@ -1527,7 +1513,7 @@
           <w:noProof/>
         </w:rPr>
       </w:pPr>
-      <w:hyperlink w:anchor="_Toc242792305" w:history="1">
+      <w:hyperlink w:anchor="_Toc242961200" w:history="1">
         <w:r>
           <w:rPr>
             <w:rStyle w:val="Hipervnculo"/>
@@ -1554,7 +1540,7 @@
             <w:noProof/>
             <w:webHidden/>
           </w:rPr>
-          <w:instrText xml:space="preserve"> PAGEREF _Toc242792305 \h </w:instrText>
+          <w:instrText xml:space="preserve"> PAGEREF _Toc242961200 \h </w:instrText>
         </w:r>
         <w:r>
           <w:rPr>
@@ -1595,7 +1581,7 @@
           <w:noProof/>
         </w:rPr>
       </w:pPr>
-      <w:hyperlink w:anchor="_Toc242792306" w:history="1">
+      <w:hyperlink w:anchor="_Toc242961201" w:history="1">
         <w:r>
           <w:rPr>
             <w:rStyle w:val="Hipervnculo"/>
@@ -1622,7 +1608,7 @@
             <w:noProof/>
             <w:webHidden/>
           </w:rPr>
-          <w:instrText xml:space="preserve"> PAGEREF _Toc242792306 \h </w:instrText>
+          <w:instrText xml:space="preserve"> PAGEREF _Toc242961201 \h </w:instrText>
         </w:r>
         <w:r>
           <w:rPr>
@@ -1663,7 +1649,7 @@
           <w:noProof/>
         </w:rPr>
       </w:pPr>
-      <w:hyperlink w:anchor="_Toc242792307" w:history="1">
+      <w:hyperlink w:anchor="_Toc242961202" w:history="1">
         <w:r>
           <w:rPr>
             <w:rStyle w:val="Hipervnculo"/>
@@ -1690,7 +1676,7 @@
             <w:noProof/>
             <w:webHidden/>
           </w:rPr>
-          <w:instrText xml:space="preserve"> PAGEREF _Toc242792307 \h </w:instrText>
+          <w:instrText xml:space="preserve"> PAGEREF _Toc242961202 \h </w:instrText>
         </w:r>
         <w:r>
           <w:rPr>
@@ -1731,7 +1717,7 @@
           <w:noProof/>
         </w:rPr>
       </w:pPr>
-      <w:hyperlink w:anchor="_Toc242792308" w:history="1">
+      <w:hyperlink w:anchor="_Toc242961203" w:history="1">
         <w:r>
           <w:rPr>
             <w:rStyle w:val="Hipervnculo"/>
@@ -1758,7 +1744,7 @@
             <w:noProof/>
             <w:webHidden/>
           </w:rPr>
-          <w:instrText xml:space="preserve"> PAGEREF _Toc242792308 \h </w:instrText>
+          <w:instrText xml:space="preserve"> PAGEREF _Toc242961203 \h </w:instrText>
         </w:r>
         <w:r>
           <w:rPr>
@@ -1799,7 +1785,7 @@
           <w:noProof/>
         </w:rPr>
       </w:pPr>
-      <w:hyperlink w:anchor="_Toc242792309" w:history="1">
+      <w:hyperlink w:anchor="_Toc242961204" w:history="1">
         <w:r>
           <w:rPr>
             <w:rStyle w:val="Hipervnculo"/>
@@ -1826,7 +1812,7 @@
             <w:noProof/>
             <w:webHidden/>
           </w:rPr>
-          <w:instrText xml:space="preserve"> PAGEREF _Toc242792309 \h </w:instrText>
+          <w:instrText xml:space="preserve"> PAGEREF _Toc242961204 \h </w:instrText>
         </w:r>
         <w:r>
           <w:rPr>
@@ -1867,7 +1853,7 @@
           <w:noProof/>
         </w:rPr>
       </w:pPr>
-      <w:hyperlink w:anchor="_Toc242792310" w:history="1">
+      <w:hyperlink w:anchor="_Toc242961205" w:history="1">
         <w:r>
           <w:rPr>
             <w:rStyle w:val="Hipervnculo"/>
@@ -1894,7 +1880,7 @@
             <w:noProof/>
             <w:webHidden/>
           </w:rPr>
-          <w:instrText xml:space="preserve"> PAGEREF _Toc242792310 \h </w:instrText>
+          <w:instrText xml:space="preserve"> PAGEREF _Toc242961205 \h </w:instrText>
         </w:r>
         <w:r>
           <w:rPr>
@@ -1935,7 +1921,7 @@
           <w:noProof/>
         </w:rPr>
       </w:pPr>
-      <w:hyperlink w:anchor="_Toc242792311" w:history="1">
+      <w:hyperlink w:anchor="_Toc242961206" w:history="1">
         <w:r>
           <w:rPr>
             <w:rStyle w:val="Hipervnculo"/>
@@ -1962,7 +1948,7 @@
             <w:noProof/>
             <w:webHidden/>
           </w:rPr>
-          <w:instrText xml:space="preserve"> PAGEREF _Toc242792311 \h </w:instrText>
+          <w:instrText xml:space="preserve"> PAGEREF _Toc242961206 \h </w:instrText>
         </w:r>
         <w:r>
           <w:rPr>
@@ -2003,7 +1989,7 @@
           <w:noProof/>
         </w:rPr>
       </w:pPr>
-      <w:hyperlink w:anchor="_Toc242792312" w:history="1">
+      <w:hyperlink w:anchor="_Toc242961207" w:history="1">
         <w:r>
           <w:rPr>
             <w:rStyle w:val="Hipervnculo"/>
@@ -2030,7 +2016,7 @@
             <w:noProof/>
             <w:webHidden/>
           </w:rPr>
-          <w:instrText xml:space="preserve"> PAGEREF _Toc242792312 \h </w:instrText>
+          <w:instrText xml:space="preserve"> PAGEREF _Toc242961207 \h </w:instrText>
         </w:r>
         <w:r>
           <w:rPr>
@@ -2071,7 +2057,7 @@
           <w:noProof/>
         </w:rPr>
       </w:pPr>
-      <w:hyperlink w:anchor="_Toc242792313" w:history="1">
+      <w:hyperlink w:anchor="_Toc242961208" w:history="1">
         <w:r>
           <w:rPr>
             <w:rStyle w:val="Hipervnculo"/>
@@ -2098,7 +2084,7 @@
             <w:noProof/>
             <w:webHidden/>
           </w:rPr>
-          <w:instrText xml:space="preserve"> PAGEREF _Toc242792313 \h </w:instrText>
+          <w:instrText xml:space="preserve"> PAGEREF _Toc242961208 \h </w:instrText>
         </w:r>
         <w:r>
           <w:rPr>
@@ -2139,7 +2125,7 @@
           <w:noProof/>
         </w:rPr>
       </w:pPr>
-      <w:hyperlink w:anchor="_Toc242792314" w:history="1">
+      <w:hyperlink w:anchor="_Toc242961209" w:history="1">
         <w:r>
           <w:rPr>
             <w:rStyle w:val="Hipervnculo"/>
@@ -2166,7 +2152,7 @@
             <w:noProof/>
             <w:webHidden/>
           </w:rPr>
-          <w:instrText xml:space="preserve"> PAGEREF _Toc242792314 \h </w:instrText>
+          <w:instrText xml:space="preserve"> PAGEREF _Toc242961209 \h </w:instrText>
         </w:r>
         <w:r>
           <w:rPr>
@@ -2207,7 +2193,7 @@
           <w:noProof/>
         </w:rPr>
       </w:pPr>
-      <w:hyperlink w:anchor="_Toc242792315" w:history="1">
+      <w:hyperlink w:anchor="_Toc242961210" w:history="1">
         <w:r>
           <w:rPr>
             <w:rStyle w:val="Hipervnculo"/>
@@ -2234,7 +2220,7 @@
             <w:noProof/>
             <w:webHidden/>
           </w:rPr>
-          <w:instrText xml:space="preserve"> PAGEREF _Toc242792315 \h </w:instrText>
+          <w:instrText xml:space="preserve"> PAGEREF _Toc242961210 \h </w:instrText>
         </w:r>
         <w:r>
           <w:rPr>
@@ -2275,7 +2261,7 @@
           <w:noProof/>
         </w:rPr>
       </w:pPr>
-      <w:hyperlink w:anchor="_Toc242792316" w:history="1">
+      <w:hyperlink w:anchor="_Toc242961211" w:history="1">
         <w:r>
           <w:rPr>
             <w:rStyle w:val="Hipervnculo"/>
@@ -2302,7 +2288,7 @@
             <w:noProof/>
             <w:webHidden/>
           </w:rPr>
-          <w:instrText xml:space="preserve"> PAGEREF _Toc242792316 \h </w:instrText>
+          <w:instrText xml:space="preserve"> PAGEREF _Toc242961211 \h </w:instrText>
         </w:r>
         <w:r>
           <w:rPr>
@@ -2343,7 +2329,7 @@
           <w:noProof/>
         </w:rPr>
       </w:pPr>
-      <w:hyperlink w:anchor="_Toc242792317" w:history="1">
+      <w:hyperlink w:anchor="_Toc242961212" w:history="1">
         <w:r>
           <w:rPr>
             <w:rStyle w:val="Hipervnculo"/>
@@ -2370,7 +2356,7 @@
             <w:noProof/>
             <w:webHidden/>
           </w:rPr>
-          <w:instrText xml:space="preserve"> PAGEREF _Toc242792317 \h </w:instrText>
+          <w:instrText xml:space="preserve"> PAGEREF _Toc242961212 \h </w:instrText>
         </w:r>
         <w:r>
           <w:rPr>
@@ -2411,7 +2397,7 @@
           <w:noProof/>
         </w:rPr>
       </w:pPr>
-      <w:hyperlink w:anchor="_Toc242792318" w:history="1">
+      <w:hyperlink w:anchor="_Toc242961213" w:history="1">
         <w:r>
           <w:rPr>
             <w:rStyle w:val="Hipervnculo"/>
@@ -2438,7 +2424,7 @@
             <w:noProof/>
             <w:webHidden/>
           </w:rPr>
-          <w:instrText xml:space="preserve"> PAGEREF _Toc242792318 \h </w:instrText>
+          <w:instrText xml:space="preserve"> PAGEREF _Toc242961213 \h </w:instrText>
         </w:r>
         <w:r>
           <w:rPr>
@@ -2479,7 +2465,7 @@
           <w:noProof/>
         </w:rPr>
       </w:pPr>
-      <w:hyperlink w:anchor="_Toc242792319" w:history="1">
+      <w:hyperlink w:anchor="_Toc242961214" w:history="1">
         <w:r>
           <w:rPr>
             <w:rStyle w:val="Hipervnculo"/>
@@ -2506,7 +2492,7 @@
             <w:noProof/>
             <w:webHidden/>
           </w:rPr>
-          <w:instrText xml:space="preserve"> PAGEREF _Toc242792319 \h </w:instrText>
+          <w:instrText xml:space="preserve"> PAGEREF _Toc242961214 \h </w:instrText>
         </w:r>
         <w:r>
           <w:rPr>
@@ -2547,7 +2533,7 @@
           <w:noProof/>
         </w:rPr>
       </w:pPr>
-      <w:hyperlink w:anchor="_Toc242792320" w:history="1">
+      <w:hyperlink w:anchor="_Toc242961215" w:history="1">
         <w:r>
           <w:rPr>
             <w:rStyle w:val="Hipervnculo"/>
@@ -2574,7 +2560,7 @@
             <w:noProof/>
             <w:webHidden/>
           </w:rPr>
-          <w:instrText xml:space="preserve"> PAGEREF _Toc242792320 \h </w:instrText>
+          <w:instrText xml:space="preserve"> PAGEREF _Toc242961215 \h </w:instrText>
         </w:r>
         <w:r>
           <w:rPr>
@@ -2619,7 +2605,7 @@
       <w:pPr>
         <w:pStyle w:val="Ttulo1"/>
       </w:pPr>
-      <w:bookmarkStart w:id="0" w:name="_Toc242792284"/>
+      <w:bookmarkStart w:id="0" w:name="_Toc242961179"/>
       <w:r>
         <w:rPr>
           <w:rFonts w:ascii="Times New Roman" w:eastAsia="Times New Roman" w:hAnsi="Times New Roman" w:cs="Times New Roman"/>
@@ -2711,7 +2697,7 @@
       <w:pPr>
         <w:pStyle w:val="Ttulo1"/>
       </w:pPr>
-      <w:bookmarkStart w:id="1" w:name="_Toc242792285"/>
+      <w:bookmarkStart w:id="1" w:name="_Toc242961180"/>
       <w:r>
         <w:rPr>
           <w:rFonts w:ascii="Times New Roman" w:eastAsia="Times New Roman" w:hAnsi="Times New Roman" w:cs="Times New Roman"/>
@@ -2725,7 +2711,7 @@
       <w:pPr>
         <w:pStyle w:val="Ttulo2"/>
       </w:pPr>
-      <w:bookmarkStart w:id="2" w:name="_Toc242792286"/>
+      <w:bookmarkStart w:id="2" w:name="_Toc242961181"/>
       <w:r>
         <w:rPr>
           <w:rFonts w:ascii="Times New Roman" w:eastAsia="Times New Roman" w:hAnsi="Times New Roman" w:cs="Times New Roman"/>
@@ -2746,7 +2732,7 @@
       <w:pPr>
         <w:pStyle w:val="Ttulo2"/>
       </w:pPr>
-      <w:bookmarkStart w:id="3" w:name="_Toc242792287"/>
+      <w:bookmarkStart w:id="3" w:name="_Toc242961182"/>
       <w:r>
         <w:rPr>
           <w:rFonts w:ascii="Times New Roman" w:eastAsia="Times New Roman" w:hAnsi="Times New Roman" w:cs="Times New Roman"/>
@@ -2807,7 +2793,7 @@
       <w:pPr>
         <w:pStyle w:val="Ttulo1"/>
       </w:pPr>
-      <w:bookmarkStart w:id="4" w:name="_Toc242792288"/>
+      <w:bookmarkStart w:id="4" w:name="_Toc242961183"/>
       <w:r>
         <w:rPr>
           <w:rFonts w:ascii="Times New Roman" w:eastAsia="Times New Roman" w:hAnsi="Times New Roman" w:cs="Times New Roman"/>
@@ -3270,7 +3256,7 @@
       <w:pPr>
         <w:pStyle w:val="Ttulo1"/>
       </w:pPr>
-      <w:bookmarkStart w:id="5" w:name="_Toc242792289"/>
+      <w:bookmarkStart w:id="5" w:name="_Toc242961184"/>
       <w:r>
         <w:rPr>
           <w:rFonts w:ascii="Times New Roman" w:eastAsia="Times New Roman" w:hAnsi="Times New Roman" w:cs="Times New Roman"/>
@@ -3302,7 +3288,7 @@
       <w:pPr>
         <w:pStyle w:val="Ttulo2"/>
       </w:pPr>
-      <w:bookmarkStart w:id="6" w:name="_Toc242792290"/>
+      <w:bookmarkStart w:id="6" w:name="_Toc242961185"/>
       <w:r>
         <w:rPr>
           <w:rFonts w:ascii="Times New Roman" w:eastAsia="Times New Roman" w:hAnsi="Times New Roman" w:cs="Times New Roman"/>
@@ -3391,7 +3377,7 @@
           <w:noProof/>
         </w:rPr>
         <w:drawing>
-          <wp:inline distT="0" distB="0" distL="0" distR="0" wp14:anchorId="6165060F" wp14:editId="7BA64616">
+          <wp:inline distT="0" distB="0" distL="0" distR="0" wp14:anchorId="74C7F4CA" wp14:editId="3606E517">
             <wp:extent cx="5943600" cy="3075618"/>
             <wp:effectExtent l="0" t="0" r="0" b="0"/>
             <wp:docPr id="1" name="Picture 1"/>
@@ -3505,7 +3491,7 @@
           <w:noProof/>
         </w:rPr>
         <w:drawing>
-          <wp:inline distT="0" distB="0" distL="0" distR="0" wp14:anchorId="34DBB5A0" wp14:editId="6BD389DF">
+          <wp:inline distT="0" distB="0" distL="0" distR="0" wp14:anchorId="418F7900" wp14:editId="3821C014">
             <wp:extent cx="5943600" cy="3415004"/>
             <wp:effectExtent l="0" t="0" r="0" b="0"/>
             <wp:docPr id="2" name="Picture 2"/>
@@ -3567,7 +3553,7 @@
       <w:pPr>
         <w:pStyle w:val="Ttulo2"/>
       </w:pPr>
-      <w:bookmarkStart w:id="7" w:name="_Toc242792291"/>
+      <w:bookmarkStart w:id="7" w:name="_Toc242961186"/>
       <w:r>
         <w:rPr>
           <w:rFonts w:ascii="Times New Roman" w:eastAsia="Times New Roman" w:hAnsi="Times New Roman" w:cs="Times New Roman"/>
@@ -3992,7 +3978,7 @@
           <w:noProof/>
         </w:rPr>
         <w:drawing>
-          <wp:inline distT="0" distB="0" distL="0" distR="0" wp14:anchorId="2D5D2C8B" wp14:editId="6A82A623">
+          <wp:inline distT="0" distB="0" distL="0" distR="0" wp14:anchorId="01D29942" wp14:editId="074E323A">
             <wp:extent cx="5943600" cy="3116766"/>
             <wp:effectExtent l="0" t="0" r="0" b="0"/>
             <wp:docPr id="3" name="Picture 3"/>
@@ -4089,7 +4075,7 @@
       <w:pPr>
         <w:pStyle w:val="Ttulo2"/>
       </w:pPr>
-      <w:bookmarkStart w:id="8" w:name="_Toc242792292"/>
+      <w:bookmarkStart w:id="8" w:name="_Toc242961187"/>
       <w:r>
         <w:rPr>
           <w:rFonts w:ascii="Times New Roman" w:eastAsia="Times New Roman" w:hAnsi="Times New Roman" w:cs="Times New Roman"/>
@@ -4271,7 +4257,7 @@
           <w:noProof/>
         </w:rPr>
         <w:drawing>
-          <wp:inline distT="0" distB="0" distL="0" distR="0" wp14:anchorId="312C7E28" wp14:editId="12F09E86">
+          <wp:inline distT="0" distB="0" distL="0" distR="0" wp14:anchorId="5DE985DB" wp14:editId="62C10886">
             <wp:extent cx="5943600" cy="3241210"/>
             <wp:effectExtent l="0" t="0" r="0" b="0"/>
             <wp:docPr id="4" name="Picture 4"/>
@@ -4497,7 +4483,7 @@
           <w:noProof/>
         </w:rPr>
         <w:drawing>
-          <wp:inline distT="0" distB="0" distL="0" distR="0" wp14:anchorId="33FE33ED" wp14:editId="3A1ADC3F">
+          <wp:inline distT="0" distB="0" distL="0" distR="0" wp14:anchorId="2270F5C4" wp14:editId="6291280F">
             <wp:extent cx="5943600" cy="2613842"/>
             <wp:effectExtent l="0" t="0" r="0" b="0"/>
             <wp:docPr id="5" name="Picture 5"/>
@@ -4760,7 +4746,7 @@
           <w:noProof/>
         </w:rPr>
         <w:drawing>
-          <wp:inline distT="0" distB="0" distL="0" distR="0" wp14:anchorId="33802BDD" wp14:editId="571F81FE">
+          <wp:inline distT="0" distB="0" distL="0" distR="0" wp14:anchorId="75BAA8B4" wp14:editId="14E6F8C1">
             <wp:extent cx="5943600" cy="3686483"/>
             <wp:effectExtent l="0" t="0" r="0" b="0"/>
             <wp:docPr id="6" name="Picture 6"/>
@@ -4991,7 +4977,7 @@
       <w:pPr>
         <w:pStyle w:val="Ttulo2"/>
       </w:pPr>
-      <w:bookmarkStart w:id="9" w:name="_Toc242792293"/>
+      <w:bookmarkStart w:id="9" w:name="_Toc242961188"/>
       <w:r>
         <w:rPr>
           <w:rFonts w:ascii="Times New Roman" w:eastAsia="Times New Roman" w:hAnsi="Times New Roman" w:cs="Times New Roman"/>
@@ -5632,7 +5618,7 @@
           <w:noProof/>
         </w:rPr>
         <w:drawing>
-          <wp:inline distT="0" distB="0" distL="0" distR="0" wp14:anchorId="6ECADCC4" wp14:editId="77842FD4">
+          <wp:inline distT="0" distB="0" distL="0" distR="0" wp14:anchorId="7BE1C539" wp14:editId="1F5815FE">
             <wp:extent cx="5943600" cy="3915988"/>
             <wp:effectExtent l="0" t="0" r="0" b="0"/>
             <wp:docPr id="7" name="Picture 7"/>
@@ -5696,7 +5682,7 @@
         <w:ind w:firstLine="720"/>
       </w:pPr>
       <w:r>
-        <w:t xml:space="preserve">Inicié sesión en SonarCloud con la cuenta de GitHub, importé el repositorio y ejecuté el análisis automático (Figuras 11 y 12). La deuda técnica es la metáfora de tomar atajos que funcionan hoy pero que generan “intereses”: cada cambio futuro cuesta más hasta que se paga la deuda refactorizando. Los </w:t>
+        <w:t xml:space="preserve">El procedimiento consiste en iniciar sesión en SonarCloud con la cuenta de GitHub, importar el repositorio y ejecutar el análisis automático (Figuras 11 y 12). La deuda técnica es la metáfora de tomar atajos que funcionan hoy pero que generan “intereses”: cada cambio futuro cuesta más hasta que se paga la deuda refactorizando. Los </w:t>
       </w:r>
       <w:r>
         <w:rPr>
@@ -5714,7 +5700,11 @@
         <w:t>code smells</w:t>
       </w:r>
       <w:r>
-        <w:t>) son los síntomas visibles de esa deuda en el código: no rompen la funcionalidad, pero dificultan entenderlo y cambiarlo (Fowler, 2018). SonarCloud los clasifica en la dimensión de mantenibilidad, estima el tiempo de remediación y asigna una calificación de la A a la E (SonarSource, s.f.).</w:t>
+        <w:t xml:space="preserve">) son los síntomas visibles de esa deuda en el código: no rompen la funcionalidad, pero dificultan entenderlo y cambiarlo (Fowler, 2018). SonarCloud los clasifica en la dimensión de </w:t>
+      </w:r>
+      <w:r>
+        <w:lastRenderedPageBreak/>
+        <w:t>mantenibilidad, estima el tiempo de remediación y asigna una calificación de la A a la E (SonarSource, s.f.).</w:t>
       </w:r>
     </w:p>
     <w:p>
@@ -5722,8 +5712,7 @@
         <w:ind w:firstLine="720"/>
       </w:pPr>
       <w:r>
-        <w:lastRenderedPageBreak/>
-        <w:t xml:space="preserve">Al revisar el </w:t>
+        <w:t xml:space="preserve">A partir de la revisión manual del </w:t>
       </w:r>
       <w:r>
         <w:rPr>
@@ -5733,7 +5722,16 @@
         <w:t>index.html</w:t>
       </w:r>
       <w:r>
-        <w:t xml:space="preserve"> del taller, estos son los malos olores intencionales que el análisis pone en evidencia (la lista exacta de reglas depende del perfil de calidad activo, por defecto “Sonar way”):</w:t>
+        <w:t xml:space="preserve"> del taller, entre los malos olores esperados están los siguientes. Cuáles de ellos reporta SonarCloud como </w:t>
+      </w:r>
+      <w:r>
+        <w:rPr>
+          <w:i/>
+        </w:rPr>
+        <w:t>code smells</w:t>
+      </w:r>
+      <w:r>
+        <w:t>, con qué severidad y cuántos minutos de deuda, depende del perfil de calidad activo (por defecto, “Sonar way”) y debe confirmarse en el dashboard del proyecto:</w:t>
       </w:r>
     </w:p>
     <w:p>
@@ -5931,7 +5929,11 @@
         <w:t>onclick</w:t>
       </w:r>
       <w:r>
-        <w:t>; cambiar el estilo de los botones exige tocar el HTML; introducir una CSP rompe los botones. El “capital” de la deuda es el atajo y el “interés” es el tiempo extra de cada cambio, que SonarCloud cuantifica en minutos de remediación.</w:t>
+        <w:t xml:space="preserve">; cambiar el estilo de los botones exige tocar el HTML; introducir una </w:t>
+      </w:r>
+      <w:r>
+        <w:lastRenderedPageBreak/>
+        <w:t>CSP rompe los botones. El “capital” de la deuda es el atajo y el “interés” es el tiempo extra de cada cambio, que SonarCloud cuantifica en minutos de remediación.</w:t>
       </w:r>
     </w:p>
     <w:p>
@@ -5942,7 +5944,6 @@
         <w:rPr>
           <w:b/>
         </w:rPr>
-        <w:lastRenderedPageBreak/>
         <w:t>Figura 11</w:t>
       </w:r>
     </w:p>
@@ -6291,6 +6292,7 @@
                 <w:rFonts w:ascii="Courier New" w:eastAsia="Courier New" w:hAnsi="Courier New" w:cs="Courier New"/>
                 <w:sz w:val="17"/>
               </w:rPr>
+              <w:lastRenderedPageBreak/>
               <w:t xml:space="preserve">  push: # Se activa con CADA push (commit)</w:t>
             </w:r>
           </w:p>
@@ -6363,7 +6365,6 @@
                 <w:rFonts w:ascii="Courier New" w:eastAsia="Courier New" w:hAnsi="Courier New" w:cs="Courier New"/>
                 <w:sz w:val="17"/>
               </w:rPr>
-              <w:lastRenderedPageBreak/>
               <w:t xml:space="preserve">  build:</w:t>
             </w:r>
           </w:p>
@@ -6937,6 +6938,7 @@
         <w:rPr>
           <w:b/>
         </w:rPr>
+        <w:lastRenderedPageBreak/>
         <w:t>Se aprovisiona el entorno.</w:t>
       </w:r>
       <w:r>
@@ -6971,7 +6973,6 @@
         <w:rPr>
           <w:b/>
         </w:rPr>
-        <w:lastRenderedPageBreak/>
         <w:t>Se extrae el código.</w:t>
       </w:r>
       <w:r>
@@ -7172,7 +7173,7 @@
           <w:noProof/>
         </w:rPr>
         <w:drawing>
-          <wp:inline distT="0" distB="0" distL="0" distR="0" wp14:anchorId="252BD61F" wp14:editId="1DC231B7">
+          <wp:inline distT="0" distB="0" distL="0" distR="0" wp14:anchorId="11507589" wp14:editId="56B9CE74">
             <wp:extent cx="5943600" cy="3915988"/>
             <wp:effectExtent l="0" t="0" r="0" b="0"/>
             <wp:docPr id="8" name="Picture 8"/>
@@ -7254,7 +7255,7 @@
           <w:noProof/>
         </w:rPr>
         <w:drawing>
-          <wp:inline distT="0" distB="0" distL="0" distR="0" wp14:anchorId="3DF9F3C6" wp14:editId="3909D8E8">
+          <wp:inline distT="0" distB="0" distL="0" distR="0" wp14:anchorId="31320F22" wp14:editId="687B60C5">
             <wp:extent cx="5943600" cy="3915988"/>
             <wp:effectExtent l="0" t="0" r="0" b="0"/>
             <wp:docPr id="9" name="Picture 9"/>
@@ -7336,7 +7337,7 @@
           <w:noProof/>
         </w:rPr>
         <w:drawing>
-          <wp:inline distT="0" distB="0" distL="0" distR="0" wp14:anchorId="49D31E4A" wp14:editId="433DC6D6">
+          <wp:inline distT="0" distB="0" distL="0" distR="0" wp14:anchorId="603C421A" wp14:editId="02C0C5CD">
             <wp:extent cx="5943600" cy="3915988"/>
             <wp:effectExtent l="0" t="0" r="0" b="0"/>
             <wp:docPr id="10" name="Picture 10"/>
@@ -8762,7 +8763,7 @@
       <w:pPr>
         <w:pStyle w:val="Ttulo2"/>
       </w:pPr>
-      <w:bookmarkStart w:id="10" w:name="_Toc242792294"/>
+      <w:bookmarkStart w:id="10" w:name="_Toc242961189"/>
       <w:r>
         <w:rPr>
           <w:rFonts w:ascii="Times New Roman" w:eastAsia="Times New Roman" w:hAnsi="Times New Roman" w:cs="Times New Roman"/>
@@ -8842,7 +8843,7 @@
           <w:noProof/>
         </w:rPr>
         <w:drawing>
-          <wp:inline distT="0" distB="0" distL="0" distR="0" wp14:anchorId="3401E44C" wp14:editId="47A0084F">
+          <wp:inline distT="0" distB="0" distL="0" distR="0" wp14:anchorId="38710198" wp14:editId="6256FFEE">
             <wp:extent cx="5943600" cy="3480878"/>
             <wp:effectExtent l="0" t="0" r="0" b="0"/>
             <wp:docPr id="11" name="Picture 11"/>
@@ -9212,7 +9213,7 @@
           <w:noProof/>
         </w:rPr>
         <w:drawing>
-          <wp:inline distT="0" distB="0" distL="0" distR="0" wp14:anchorId="616B8A3A" wp14:editId="75A2B081">
+          <wp:inline distT="0" distB="0" distL="0" distR="0" wp14:anchorId="3EA54AE4" wp14:editId="6636E936">
             <wp:extent cx="5943600" cy="3480878"/>
             <wp:effectExtent l="0" t="0" r="0" b="0"/>
             <wp:docPr id="12" name="Picture 12"/>
@@ -9463,7 +9464,7 @@
           <w:noProof/>
         </w:rPr>
         <w:drawing>
-          <wp:inline distT="0" distB="0" distL="0" distR="0" wp14:anchorId="7D5A321B" wp14:editId="08412FB8">
+          <wp:inline distT="0" distB="0" distL="0" distR="0" wp14:anchorId="639DBB65" wp14:editId="352AF86B">
             <wp:extent cx="5943600" cy="4335175"/>
             <wp:effectExtent l="0" t="0" r="0" b="0"/>
             <wp:docPr id="13" name="Picture 13"/>
@@ -10142,7 +10143,7 @@
           <w:noProof/>
         </w:rPr>
         <w:drawing>
-          <wp:inline distT="0" distB="0" distL="0" distR="0" wp14:anchorId="47D06DB3" wp14:editId="220D4D49">
+          <wp:inline distT="0" distB="0" distL="0" distR="0" wp14:anchorId="4C88FBD5" wp14:editId="3E3207D9">
             <wp:extent cx="5943600" cy="2795863"/>
             <wp:effectExtent l="0" t="0" r="0" b="0"/>
             <wp:docPr id="14" name="Picture 14"/>
@@ -10275,7 +10276,7 @@
       <w:pPr>
         <w:pStyle w:val="Ttulo1"/>
       </w:pPr>
-      <w:bookmarkStart w:id="11" w:name="_Toc242792295"/>
+      <w:bookmarkStart w:id="11" w:name="_Toc242961190"/>
       <w:r>
         <w:rPr>
           <w:rFonts w:ascii="Times New Roman" w:eastAsia="Times New Roman" w:hAnsi="Times New Roman" w:cs="Times New Roman"/>
@@ -10326,7 +10327,7 @@
           <w:noProof/>
         </w:rPr>
         <w:drawing>
-          <wp:inline distT="0" distB="0" distL="0" distR="0" wp14:anchorId="735ABA84" wp14:editId="7AB2415A">
+          <wp:inline distT="0" distB="0" distL="0" distR="0" wp14:anchorId="2063F822" wp14:editId="36330432">
             <wp:extent cx="5943600" cy="3463740"/>
             <wp:effectExtent l="0" t="0" r="0" b="0"/>
             <wp:docPr id="15" name="Picture 15"/>
@@ -10388,7 +10389,7 @@
       <w:pPr>
         <w:pStyle w:val="Ttulo2"/>
       </w:pPr>
-      <w:bookmarkStart w:id="12" w:name="_Toc242792296"/>
+      <w:bookmarkStart w:id="12" w:name="_Toc242961191"/>
       <w:r>
         <w:rPr>
           <w:rFonts w:ascii="Times New Roman" w:eastAsia="Times New Roman" w:hAnsi="Times New Roman" w:cs="Times New Roman"/>
@@ -11038,7 +11039,7 @@
           <w:noProof/>
         </w:rPr>
         <w:drawing>
-          <wp:inline distT="0" distB="0" distL="0" distR="0" wp14:anchorId="23820D03" wp14:editId="4F39F48B">
+          <wp:inline distT="0" distB="0" distL="0" distR="0" wp14:anchorId="5E34D5D1" wp14:editId="2BFBA318">
             <wp:extent cx="5943600" cy="3206877"/>
             <wp:effectExtent l="0" t="0" r="0" b="0"/>
             <wp:docPr id="16" name="Picture 16"/>
@@ -11673,7 +11674,7 @@
       <w:pPr>
         <w:pStyle w:val="Ttulo2"/>
       </w:pPr>
-      <w:bookmarkStart w:id="13" w:name="_Toc242792297"/>
+      <w:bookmarkStart w:id="13" w:name="_Toc242961192"/>
       <w:r>
         <w:rPr>
           <w:rFonts w:ascii="Times New Roman" w:eastAsia="Times New Roman" w:hAnsi="Times New Roman" w:cs="Times New Roman"/>
@@ -12194,7 +12195,7 @@
       <w:pPr>
         <w:pStyle w:val="Ttulo2"/>
       </w:pPr>
-      <w:bookmarkStart w:id="14" w:name="_Toc242792298"/>
+      <w:bookmarkStart w:id="14" w:name="_Toc242961193"/>
       <w:r>
         <w:rPr>
           <w:rFonts w:ascii="Times New Roman" w:eastAsia="Times New Roman" w:hAnsi="Times New Roman" w:cs="Times New Roman"/>
@@ -13233,7 +13234,7 @@
       <w:pPr>
         <w:pStyle w:val="Ttulo1"/>
       </w:pPr>
-      <w:bookmarkStart w:id="15" w:name="_Toc242792299"/>
+      <w:bookmarkStart w:id="15" w:name="_Toc242961194"/>
       <w:r>
         <w:rPr>
           <w:rFonts w:ascii="Times New Roman" w:eastAsia="Times New Roman" w:hAnsi="Times New Roman" w:cs="Times New Roman"/>
@@ -13247,7 +13248,7 @@
       <w:pPr>
         <w:pStyle w:val="Ttulo2"/>
       </w:pPr>
-      <w:bookmarkStart w:id="16" w:name="_Toc242792300"/>
+      <w:bookmarkStart w:id="16" w:name="_Toc242961195"/>
       <w:r>
         <w:rPr>
           <w:rFonts w:ascii="Times New Roman" w:eastAsia="Times New Roman" w:hAnsi="Times New Roman" w:cs="Times New Roman"/>
@@ -13277,7 +13278,7 @@
       <w:pPr>
         <w:pStyle w:val="Ttulo2"/>
       </w:pPr>
-      <w:bookmarkStart w:id="17" w:name="_Toc242792301"/>
+      <w:bookmarkStart w:id="17" w:name="_Toc242961196"/>
       <w:r>
         <w:rPr>
           <w:rFonts w:ascii="Times New Roman" w:eastAsia="Times New Roman" w:hAnsi="Times New Roman" w:cs="Times New Roman"/>
@@ -13429,7 +13430,7 @@
       <w:pPr>
         <w:pStyle w:val="Ttulo2"/>
       </w:pPr>
-      <w:bookmarkStart w:id="18" w:name="_Toc242792302"/>
+      <w:bookmarkStart w:id="18" w:name="_Toc242961197"/>
       <w:r>
         <w:rPr>
           <w:rFonts w:ascii="Times New Roman" w:eastAsia="Times New Roman" w:hAnsi="Times New Roman" w:cs="Times New Roman"/>
@@ -13548,7 +13549,7 @@
       <w:pPr>
         <w:pStyle w:val="Ttulo2"/>
       </w:pPr>
-      <w:bookmarkStart w:id="19" w:name="_Toc242792303"/>
+      <w:bookmarkStart w:id="19" w:name="_Toc242961198"/>
       <w:r>
         <w:rPr>
           <w:rFonts w:ascii="Times New Roman" w:eastAsia="Times New Roman" w:hAnsi="Times New Roman" w:cs="Times New Roman"/>
@@ -13662,7 +13663,7 @@
       <w:pPr>
         <w:pStyle w:val="Ttulo2"/>
       </w:pPr>
-      <w:bookmarkStart w:id="20" w:name="_Toc242792304"/>
+      <w:bookmarkStart w:id="20" w:name="_Toc242961199"/>
       <w:r>
         <w:rPr>
           <w:rFonts w:ascii="Times New Roman" w:eastAsia="Times New Roman" w:hAnsi="Times New Roman" w:cs="Times New Roman"/>
@@ -13711,7 +13712,7 @@
       <w:pPr>
         <w:pStyle w:val="Ttulo2"/>
       </w:pPr>
-      <w:bookmarkStart w:id="21" w:name="_Toc242792305"/>
+      <w:bookmarkStart w:id="21" w:name="_Toc242961200"/>
       <w:r>
         <w:rPr>
           <w:rFonts w:ascii="Times New Roman" w:eastAsia="Times New Roman" w:hAnsi="Times New Roman" w:cs="Times New Roman"/>
@@ -13760,7 +13761,7 @@
       <w:pPr>
         <w:pStyle w:val="Ttulo2"/>
       </w:pPr>
-      <w:bookmarkStart w:id="22" w:name="_Toc242792306"/>
+      <w:bookmarkStart w:id="22" w:name="_Toc242961201"/>
       <w:r>
         <w:rPr>
           <w:rFonts w:ascii="Times New Roman" w:eastAsia="Times New Roman" w:hAnsi="Times New Roman" w:cs="Times New Roman"/>
@@ -13879,7 +13880,7 @@
       <w:pPr>
         <w:pStyle w:val="Ttulo2"/>
       </w:pPr>
-      <w:bookmarkStart w:id="23" w:name="_Toc242792307"/>
+      <w:bookmarkStart w:id="23" w:name="_Toc242961202"/>
       <w:r>
         <w:rPr>
           <w:rFonts w:ascii="Times New Roman" w:eastAsia="Times New Roman" w:hAnsi="Times New Roman" w:cs="Times New Roman"/>
@@ -13975,7 +13976,7 @@
       <w:pPr>
         <w:pStyle w:val="Ttulo2"/>
       </w:pPr>
-      <w:bookmarkStart w:id="24" w:name="_Toc242792308"/>
+      <w:bookmarkStart w:id="24" w:name="_Toc242961203"/>
       <w:r>
         <w:rPr>
           <w:rFonts w:ascii="Times New Roman" w:eastAsia="Times New Roman" w:hAnsi="Times New Roman" w:cs="Times New Roman"/>
@@ -14005,7 +14006,7 @@
       <w:pPr>
         <w:pStyle w:val="Ttulo2"/>
       </w:pPr>
-      <w:bookmarkStart w:id="25" w:name="_Toc242792309"/>
+      <w:bookmarkStart w:id="25" w:name="_Toc242961204"/>
       <w:r>
         <w:rPr>
           <w:rFonts w:ascii="Times New Roman" w:eastAsia="Times New Roman" w:hAnsi="Times New Roman" w:cs="Times New Roman"/>
@@ -14057,7 +14058,7 @@
       <w:pPr>
         <w:pStyle w:val="Ttulo2"/>
       </w:pPr>
-      <w:bookmarkStart w:id="26" w:name="_Toc242792310"/>
+      <w:bookmarkStart w:id="26" w:name="_Toc242961205"/>
       <w:r>
         <w:rPr>
           <w:rFonts w:ascii="Times New Roman" w:eastAsia="Times New Roman" w:hAnsi="Times New Roman" w:cs="Times New Roman"/>
@@ -14280,7 +14281,7 @@
       <w:pPr>
         <w:pStyle w:val="Ttulo2"/>
       </w:pPr>
-      <w:bookmarkStart w:id="27" w:name="_Toc242792311"/>
+      <w:bookmarkStart w:id="27" w:name="_Toc242961206"/>
       <w:r>
         <w:rPr>
           <w:rFonts w:ascii="Times New Roman" w:eastAsia="Times New Roman" w:hAnsi="Times New Roman" w:cs="Times New Roman"/>
@@ -14322,7 +14323,7 @@
       <w:pPr>
         <w:pStyle w:val="Ttulo2"/>
       </w:pPr>
-      <w:bookmarkStart w:id="28" w:name="_Toc242792312"/>
+      <w:bookmarkStart w:id="28" w:name="_Toc242961207"/>
       <w:r>
         <w:rPr>
           <w:rFonts w:ascii="Times New Roman" w:eastAsia="Times New Roman" w:hAnsi="Times New Roman" w:cs="Times New Roman"/>
@@ -14657,7 +14658,7 @@
       <w:pPr>
         <w:pStyle w:val="Ttulo2"/>
       </w:pPr>
-      <w:bookmarkStart w:id="29" w:name="_Toc242792313"/>
+      <w:bookmarkStart w:id="29" w:name="_Toc242961208"/>
       <w:r>
         <w:rPr>
           <w:rFonts w:ascii="Times New Roman" w:eastAsia="Times New Roman" w:hAnsi="Times New Roman" w:cs="Times New Roman"/>
@@ -14757,7 +14758,7 @@
       <w:pPr>
         <w:pStyle w:val="Ttulo2"/>
       </w:pPr>
-      <w:bookmarkStart w:id="30" w:name="_Toc242792314"/>
+      <w:bookmarkStart w:id="30" w:name="_Toc242961209"/>
       <w:r>
         <w:rPr>
           <w:rFonts w:ascii="Times New Roman" w:eastAsia="Times New Roman" w:hAnsi="Times New Roman" w:cs="Times New Roman"/>
@@ -14796,7 +14797,7 @@
       <w:pPr>
         <w:pStyle w:val="Ttulo2"/>
       </w:pPr>
-      <w:bookmarkStart w:id="31" w:name="_Toc242792315"/>
+      <w:bookmarkStart w:id="31" w:name="_Toc242961210"/>
       <w:r>
         <w:rPr>
           <w:rFonts w:ascii="Times New Roman" w:eastAsia="Times New Roman" w:hAnsi="Times New Roman" w:cs="Times New Roman"/>
@@ -14853,7 +14854,7 @@
       <w:pPr>
         <w:pStyle w:val="Ttulo2"/>
       </w:pPr>
-      <w:bookmarkStart w:id="32" w:name="_Toc242792316"/>
+      <w:bookmarkStart w:id="32" w:name="_Toc242961211"/>
       <w:r>
         <w:rPr>
           <w:rFonts w:ascii="Times New Roman" w:eastAsia="Times New Roman" w:hAnsi="Times New Roman" w:cs="Times New Roman"/>
@@ -14894,7 +14895,7 @@
       <w:pPr>
         <w:pStyle w:val="Ttulo2"/>
       </w:pPr>
-      <w:bookmarkStart w:id="33" w:name="_Toc242792317"/>
+      <w:bookmarkStart w:id="33" w:name="_Toc242961212"/>
       <w:r>
         <w:rPr>
           <w:rFonts w:ascii="Times New Roman" w:eastAsia="Times New Roman" w:hAnsi="Times New Roman" w:cs="Times New Roman"/>
@@ -14998,7 +14999,7 @@
       <w:pPr>
         <w:pStyle w:val="Ttulo2"/>
       </w:pPr>
-      <w:bookmarkStart w:id="34" w:name="_Toc242792318"/>
+      <w:bookmarkStart w:id="34" w:name="_Toc242961213"/>
       <w:r>
         <w:rPr>
           <w:rFonts w:ascii="Times New Roman" w:eastAsia="Times New Roman" w:hAnsi="Times New Roman" w:cs="Times New Roman"/>
@@ -15045,7 +15046,7 @@
       <w:pPr>
         <w:pStyle w:val="Ttulo1"/>
       </w:pPr>
-      <w:bookmarkStart w:id="35" w:name="_Toc242792319"/>
+      <w:bookmarkStart w:id="35" w:name="_Toc242961214"/>
       <w:r>
         <w:rPr>
           <w:rFonts w:ascii="Times New Roman" w:eastAsia="Times New Roman" w:hAnsi="Times New Roman" w:cs="Times New Roman"/>
@@ -15140,7 +15141,7 @@
       <w:pPr>
         <w:pStyle w:val="Ttulo1"/>
       </w:pPr>
-      <w:bookmarkStart w:id="36" w:name="_Toc242792320"/>
+      <w:bookmarkStart w:id="36" w:name="_Toc242961215"/>
       <w:r>
         <w:rPr>
           <w:rFonts w:ascii="Times New Roman" w:eastAsia="Times New Roman" w:hAnsi="Times New Roman" w:cs="Times New Roman"/>
@@ -15717,31 +15718,31 @@
       </w:rPr>
     </w:lvl>
   </w:abstractNum>
-  <w:num w:numId="1" w16cid:durableId="1812407960">
+  <w:num w:numId="1" w16cid:durableId="1552572174">
     <w:abstractNumId w:val="8"/>
   </w:num>
-  <w:num w:numId="2" w16cid:durableId="1158612103">
+  <w:num w:numId="2" w16cid:durableId="211963529">
     <w:abstractNumId w:val="6"/>
   </w:num>
-  <w:num w:numId="3" w16cid:durableId="448278624">
+  <w:num w:numId="3" w16cid:durableId="1969317596">
     <w:abstractNumId w:val="5"/>
   </w:num>
-  <w:num w:numId="4" w16cid:durableId="37095432">
+  <w:num w:numId="4" w16cid:durableId="1760442555">
     <w:abstractNumId w:val="4"/>
   </w:num>
-  <w:num w:numId="5" w16cid:durableId="1316178751">
+  <w:num w:numId="5" w16cid:durableId="368459045">
     <w:abstractNumId w:val="7"/>
   </w:num>
-  <w:num w:numId="6" w16cid:durableId="1747997339">
+  <w:num w:numId="6" w16cid:durableId="45225963">
     <w:abstractNumId w:val="3"/>
   </w:num>
-  <w:num w:numId="7" w16cid:durableId="1300300007">
+  <w:num w:numId="7" w16cid:durableId="1699354616">
     <w:abstractNumId w:val="2"/>
   </w:num>
-  <w:num w:numId="8" w16cid:durableId="614604402">
+  <w:num w:numId="8" w16cid:durableId="1459028535">
     <w:abstractNumId w:val="1"/>
   </w:num>
-  <w:num w:numId="9" w16cid:durableId="2090927768">
+  <w:num w:numId="9" w16cid:durableId="1988850958">
     <w:abstractNumId w:val="0"/>
   </w:num>
 </w:numbering>
@@ -27169,7 +27170,7 @@
     <w:autoRedefine/>
     <w:uiPriority w:val="39"/>
     <w:unhideWhenUsed/>
-    <w:rsid w:val="008A5F06"/>
+    <w:rsid w:val="00BC2398"/>
     <w:pPr>
       <w:spacing w:after="100"/>
     </w:pPr>
@@ -27181,7 +27182,7 @@
     <w:autoRedefine/>
     <w:uiPriority w:val="39"/>
     <w:unhideWhenUsed/>
-    <w:rsid w:val="008A5F06"/>
+    <w:rsid w:val="00BC2398"/>
     <w:pPr>
       <w:spacing w:after="100"/>
       <w:ind w:left="240"/>
@@ -27192,7 +27193,7 @@
     <w:basedOn w:val="Fuentedeprrafopredeter"/>
     <w:uiPriority w:val="99"/>
     <w:unhideWhenUsed/>
-    <w:rsid w:val="008A5F06"/>
+    <w:rsid w:val="00BC2398"/>
     <w:rPr>
       <w:color w:val="0000FF" w:themeColor="hyperlink"/>
       <w:u w:val="single"/>

</xml_diff>

<commit_message>
feat(wireframes): basar wireframes en el index.html de la guía y actualizar informe
- eventflow_malo.html: contenido exacto del index.html + las 3 fallas de la Parte A (Comprar verde, Adquirir azul, cantidad 'dos')
- eventflow_corregido.html: 3 pantallas con el mismo contenido (sin lugares, precios ni total)
- PNG de escritorio y móvil re-renderizados
- Informe: texto de Nielsen coherente con la guía; pies de fig20/fig22 apuntan al editor de Figma
- CAPTURAS_PENDIENTES.md: estado actualizado (10 pendientes)

Co-Authored-By: Claude Opus 5.5 <noreply@anthropic.com>
</commit_message>
<xml_diff>
--- a/Sexto_Semestre/Arqui_Software/taller_arqui_nube/taller-arquitectura/informe/Informe_Taller_Arquitectura.docx
+++ b/Sexto_Semestre/Arqui_Software/taller_arqui_nube/taller-arquitectura/informe/Informe_Taller_Arquitectura.docx
@@ -85,7 +85,7 @@
       <w:r>
         <w:fldChar w:fldCharType="separate"/>
       </w:r>
-      <w:hyperlink w:anchor="_Toc242961179" w:history="1">
+      <w:hyperlink w:anchor="_Toc242961504" w:history="1">
         <w:r>
           <w:rPr>
             <w:rStyle w:val="Hipervnculo"/>
@@ -112,7 +112,7 @@
             <w:noProof/>
             <w:webHidden/>
           </w:rPr>
-          <w:instrText xml:space="preserve"> PAGEREF _Toc242961179 \h </w:instrText>
+          <w:instrText xml:space="preserve"> PAGEREF _Toc242961504 \h </w:instrText>
         </w:r>
         <w:r>
           <w:rPr>
@@ -153,7 +153,7 @@
           <w:noProof/>
         </w:rPr>
       </w:pPr>
-      <w:hyperlink w:anchor="_Toc242961180" w:history="1">
+      <w:hyperlink w:anchor="_Toc242961505" w:history="1">
         <w:r>
           <w:rPr>
             <w:rStyle w:val="Hipervnculo"/>
@@ -180,7 +180,7 @@
             <w:noProof/>
             <w:webHidden/>
           </w:rPr>
-          <w:instrText xml:space="preserve"> PAGEREF _Toc242961180 \h </w:instrText>
+          <w:instrText xml:space="preserve"> PAGEREF _Toc242961505 \h </w:instrText>
         </w:r>
         <w:r>
           <w:rPr>
@@ -221,7 +221,7 @@
           <w:noProof/>
         </w:rPr>
       </w:pPr>
-      <w:hyperlink w:anchor="_Toc242961181" w:history="1">
+      <w:hyperlink w:anchor="_Toc242961506" w:history="1">
         <w:r>
           <w:rPr>
             <w:rStyle w:val="Hipervnculo"/>
@@ -248,7 +248,7 @@
             <w:noProof/>
             <w:webHidden/>
           </w:rPr>
-          <w:instrText xml:space="preserve"> PAGEREF _Toc242961181 \h </w:instrText>
+          <w:instrText xml:space="preserve"> PAGEREF _Toc242961506 \h </w:instrText>
         </w:r>
         <w:r>
           <w:rPr>
@@ -289,7 +289,7 @@
           <w:noProof/>
         </w:rPr>
       </w:pPr>
-      <w:hyperlink w:anchor="_Toc242961182" w:history="1">
+      <w:hyperlink w:anchor="_Toc242961507" w:history="1">
         <w:r>
           <w:rPr>
             <w:rStyle w:val="Hipervnculo"/>
@@ -316,7 +316,7 @@
             <w:noProof/>
             <w:webHidden/>
           </w:rPr>
-          <w:instrText xml:space="preserve"> PAGEREF _Toc242961182 \h </w:instrText>
+          <w:instrText xml:space="preserve"> PAGEREF _Toc242961507 \h </w:instrText>
         </w:r>
         <w:r>
           <w:rPr>
@@ -357,7 +357,7 @@
           <w:noProof/>
         </w:rPr>
       </w:pPr>
-      <w:hyperlink w:anchor="_Toc242961183" w:history="1">
+      <w:hyperlink w:anchor="_Toc242961508" w:history="1">
         <w:r>
           <w:rPr>
             <w:rStyle w:val="Hipervnculo"/>
@@ -384,7 +384,7 @@
             <w:noProof/>
             <w:webHidden/>
           </w:rPr>
-          <w:instrText xml:space="preserve"> PAGEREF _Toc242961183 \h </w:instrText>
+          <w:instrText xml:space="preserve"> PAGEREF _Toc242961508 \h </w:instrText>
         </w:r>
         <w:r>
           <w:rPr>
@@ -425,7 +425,7 @@
           <w:noProof/>
         </w:rPr>
       </w:pPr>
-      <w:hyperlink w:anchor="_Toc242961184" w:history="1">
+      <w:hyperlink w:anchor="_Toc242961509" w:history="1">
         <w:r>
           <w:rPr>
             <w:rStyle w:val="Hipervnculo"/>
@@ -452,7 +452,7 @@
             <w:noProof/>
             <w:webHidden/>
           </w:rPr>
-          <w:instrText xml:space="preserve"> PAGEREF _Toc242961184 \h </w:instrText>
+          <w:instrText xml:space="preserve"> PAGEREF _Toc242961509 \h </w:instrText>
         </w:r>
         <w:r>
           <w:rPr>
@@ -493,7 +493,7 @@
           <w:noProof/>
         </w:rPr>
       </w:pPr>
-      <w:hyperlink w:anchor="_Toc242961185" w:history="1">
+      <w:hyperlink w:anchor="_Toc242961510" w:history="1">
         <w:r>
           <w:rPr>
             <w:rStyle w:val="Hipervnculo"/>
@@ -520,7 +520,7 @@
             <w:noProof/>
             <w:webHidden/>
           </w:rPr>
-          <w:instrText xml:space="preserve"> PAGEREF _Toc242961185 \h </w:instrText>
+          <w:instrText xml:space="preserve"> PAGEREF _Toc242961510 \h </w:instrText>
         </w:r>
         <w:r>
           <w:rPr>
@@ -561,7 +561,7 @@
           <w:noProof/>
         </w:rPr>
       </w:pPr>
-      <w:hyperlink w:anchor="_Toc242961186" w:history="1">
+      <w:hyperlink w:anchor="_Toc242961511" w:history="1">
         <w:r>
           <w:rPr>
             <w:rStyle w:val="Hipervnculo"/>
@@ -588,7 +588,7 @@
             <w:noProof/>
             <w:webHidden/>
           </w:rPr>
-          <w:instrText xml:space="preserve"> PAGEREF _Toc242961186 \h </w:instrText>
+          <w:instrText xml:space="preserve"> PAGEREF _Toc242961511 \h </w:instrText>
         </w:r>
         <w:r>
           <w:rPr>
@@ -629,7 +629,7 @@
           <w:noProof/>
         </w:rPr>
       </w:pPr>
-      <w:hyperlink w:anchor="_Toc242961187" w:history="1">
+      <w:hyperlink w:anchor="_Toc242961512" w:history="1">
         <w:r>
           <w:rPr>
             <w:rStyle w:val="Hipervnculo"/>
@@ -656,7 +656,7 @@
             <w:noProof/>
             <w:webHidden/>
           </w:rPr>
-          <w:instrText xml:space="preserve"> PAGEREF _Toc242961187 \h </w:instrText>
+          <w:instrText xml:space="preserve"> PAGEREF _Toc242961512 \h </w:instrText>
         </w:r>
         <w:r>
           <w:rPr>
@@ -697,7 +697,7 @@
           <w:noProof/>
         </w:rPr>
       </w:pPr>
-      <w:hyperlink w:anchor="_Toc242961188" w:history="1">
+      <w:hyperlink w:anchor="_Toc242961513" w:history="1">
         <w:r>
           <w:rPr>
             <w:rStyle w:val="Hipervnculo"/>
@@ -724,7 +724,7 @@
             <w:noProof/>
             <w:webHidden/>
           </w:rPr>
-          <w:instrText xml:space="preserve"> PAGEREF _Toc242961188 \h </w:instrText>
+          <w:instrText xml:space="preserve"> PAGEREF _Toc242961513 \h </w:instrText>
         </w:r>
         <w:r>
           <w:rPr>
@@ -765,7 +765,7 @@
           <w:noProof/>
         </w:rPr>
       </w:pPr>
-      <w:hyperlink w:anchor="_Toc242961189" w:history="1">
+      <w:hyperlink w:anchor="_Toc242961514" w:history="1">
         <w:r>
           <w:rPr>
             <w:rStyle w:val="Hipervnculo"/>
@@ -792,7 +792,7 @@
             <w:noProof/>
             <w:webHidden/>
           </w:rPr>
-          <w:instrText xml:space="preserve"> PAGEREF _Toc242961189 \h </w:instrText>
+          <w:instrText xml:space="preserve"> PAGEREF _Toc242961514 \h </w:instrText>
         </w:r>
         <w:r>
           <w:rPr>
@@ -833,7 +833,7 @@
           <w:noProof/>
         </w:rPr>
       </w:pPr>
-      <w:hyperlink w:anchor="_Toc242961190" w:history="1">
+      <w:hyperlink w:anchor="_Toc242961515" w:history="1">
         <w:r>
           <w:rPr>
             <w:rStyle w:val="Hipervnculo"/>
@@ -860,7 +860,7 @@
             <w:noProof/>
             <w:webHidden/>
           </w:rPr>
-          <w:instrText xml:space="preserve"> PAGEREF _Toc242961190 \h </w:instrText>
+          <w:instrText xml:space="preserve"> PAGEREF _Toc242961515 \h </w:instrText>
         </w:r>
         <w:r>
           <w:rPr>
@@ -880,7 +880,7 @@
             <w:noProof/>
             <w:webHidden/>
           </w:rPr>
-          <w:t>40</w:t>
+          <w:t>41</w:t>
         </w:r>
         <w:r>
           <w:rPr>
@@ -901,7 +901,7 @@
           <w:noProof/>
         </w:rPr>
       </w:pPr>
-      <w:hyperlink w:anchor="_Toc242961191" w:history="1">
+      <w:hyperlink w:anchor="_Toc242961516" w:history="1">
         <w:r>
           <w:rPr>
             <w:rStyle w:val="Hipervnculo"/>
@@ -928,7 +928,7 @@
             <w:noProof/>
             <w:webHidden/>
           </w:rPr>
-          <w:instrText xml:space="preserve"> PAGEREF _Toc242961191 \h </w:instrText>
+          <w:instrText xml:space="preserve"> PAGEREF _Toc242961516 \h </w:instrText>
         </w:r>
         <w:r>
           <w:rPr>
@@ -948,7 +948,7 @@
             <w:noProof/>
             <w:webHidden/>
           </w:rPr>
-          <w:t>41</w:t>
+          <w:t>42</w:t>
         </w:r>
         <w:r>
           <w:rPr>
@@ -969,7 +969,7 @@
           <w:noProof/>
         </w:rPr>
       </w:pPr>
-      <w:hyperlink w:anchor="_Toc242961192" w:history="1">
+      <w:hyperlink w:anchor="_Toc242961517" w:history="1">
         <w:r>
           <w:rPr>
             <w:rStyle w:val="Hipervnculo"/>
@@ -996,7 +996,7 @@
             <w:noProof/>
             <w:webHidden/>
           </w:rPr>
-          <w:instrText xml:space="preserve"> PAGEREF _Toc242961192 \h </w:instrText>
+          <w:instrText xml:space="preserve"> PAGEREF _Toc242961517 \h </w:instrText>
         </w:r>
         <w:r>
           <w:rPr>
@@ -1016,7 +1016,7 @@
             <w:noProof/>
             <w:webHidden/>
           </w:rPr>
-          <w:t>45</w:t>
+          <w:t>46</w:t>
         </w:r>
         <w:r>
           <w:rPr>
@@ -1037,7 +1037,7 @@
           <w:noProof/>
         </w:rPr>
       </w:pPr>
-      <w:hyperlink w:anchor="_Toc242961193" w:history="1">
+      <w:hyperlink w:anchor="_Toc242961518" w:history="1">
         <w:r>
           <w:rPr>
             <w:rStyle w:val="Hipervnculo"/>
@@ -1064,7 +1064,7 @@
             <w:noProof/>
             <w:webHidden/>
           </w:rPr>
-          <w:instrText xml:space="preserve"> PAGEREF _Toc242961193 \h </w:instrText>
+          <w:instrText xml:space="preserve"> PAGEREF _Toc242961518 \h </w:instrText>
         </w:r>
         <w:r>
           <w:rPr>
@@ -1084,7 +1084,7 @@
             <w:noProof/>
             <w:webHidden/>
           </w:rPr>
-          <w:t>46</w:t>
+          <w:t>47</w:t>
         </w:r>
         <w:r>
           <w:rPr>
@@ -1105,7 +1105,7 @@
           <w:noProof/>
         </w:rPr>
       </w:pPr>
-      <w:hyperlink w:anchor="_Toc242961194" w:history="1">
+      <w:hyperlink w:anchor="_Toc242961519" w:history="1">
         <w:r>
           <w:rPr>
             <w:rStyle w:val="Hipervnculo"/>
@@ -1132,7 +1132,7 @@
             <w:noProof/>
             <w:webHidden/>
           </w:rPr>
-          <w:instrText xml:space="preserve"> PAGEREF _Toc242961194 \h </w:instrText>
+          <w:instrText xml:space="preserve"> PAGEREF _Toc242961519 \h </w:instrText>
         </w:r>
         <w:r>
           <w:rPr>
@@ -1152,7 +1152,7 @@
             <w:noProof/>
             <w:webHidden/>
           </w:rPr>
-          <w:t>48</w:t>
+          <w:t>49</w:t>
         </w:r>
         <w:r>
           <w:rPr>
@@ -1173,7 +1173,7 @@
           <w:noProof/>
         </w:rPr>
       </w:pPr>
-      <w:hyperlink w:anchor="_Toc242961195" w:history="1">
+      <w:hyperlink w:anchor="_Toc242961520" w:history="1">
         <w:r>
           <w:rPr>
             <w:rStyle w:val="Hipervnculo"/>
@@ -1200,7 +1200,7 @@
             <w:noProof/>
             <w:webHidden/>
           </w:rPr>
-          <w:instrText xml:space="preserve"> PAGEREF _Toc242961195 \h </w:instrText>
+          <w:instrText xml:space="preserve"> PAGEREF _Toc242961520 \h </w:instrText>
         </w:r>
         <w:r>
           <w:rPr>
@@ -1220,7 +1220,7 @@
             <w:noProof/>
             <w:webHidden/>
           </w:rPr>
-          <w:t>48</w:t>
+          <w:t>49</w:t>
         </w:r>
         <w:r>
           <w:rPr>
@@ -1241,7 +1241,7 @@
           <w:noProof/>
         </w:rPr>
       </w:pPr>
-      <w:hyperlink w:anchor="_Toc242961196" w:history="1">
+      <w:hyperlink w:anchor="_Toc242961521" w:history="1">
         <w:r>
           <w:rPr>
             <w:rStyle w:val="Hipervnculo"/>
@@ -1268,7 +1268,7 @@
             <w:noProof/>
             <w:webHidden/>
           </w:rPr>
-          <w:instrText xml:space="preserve"> PAGEREF _Toc242961196 \h </w:instrText>
+          <w:instrText xml:space="preserve"> PAGEREF _Toc242961521 \h </w:instrText>
         </w:r>
         <w:r>
           <w:rPr>
@@ -1288,7 +1288,7 @@
             <w:noProof/>
             <w:webHidden/>
           </w:rPr>
-          <w:t>48</w:t>
+          <w:t>49</w:t>
         </w:r>
         <w:r>
           <w:rPr>
@@ -1309,7 +1309,7 @@
           <w:noProof/>
         </w:rPr>
       </w:pPr>
-      <w:hyperlink w:anchor="_Toc242961197" w:history="1">
+      <w:hyperlink w:anchor="_Toc242961522" w:history="1">
         <w:r>
           <w:rPr>
             <w:rStyle w:val="Hipervnculo"/>
@@ -1336,7 +1336,7 @@
             <w:noProof/>
             <w:webHidden/>
           </w:rPr>
-          <w:instrText xml:space="preserve"> PAGEREF _Toc242961197 \h </w:instrText>
+          <w:instrText xml:space="preserve"> PAGEREF _Toc242961522 \h </w:instrText>
         </w:r>
         <w:r>
           <w:rPr>
@@ -1356,7 +1356,7 @@
             <w:noProof/>
             <w:webHidden/>
           </w:rPr>
-          <w:t>49</w:t>
+          <w:t>50</w:t>
         </w:r>
         <w:r>
           <w:rPr>
@@ -1377,7 +1377,7 @@
           <w:noProof/>
         </w:rPr>
       </w:pPr>
-      <w:hyperlink w:anchor="_Toc242961198" w:history="1">
+      <w:hyperlink w:anchor="_Toc242961523" w:history="1">
         <w:r>
           <w:rPr>
             <w:rStyle w:val="Hipervnculo"/>
@@ -1404,7 +1404,7 @@
             <w:noProof/>
             <w:webHidden/>
           </w:rPr>
-          <w:instrText xml:space="preserve"> PAGEREF _Toc242961198 \h </w:instrText>
+          <w:instrText xml:space="preserve"> PAGEREF _Toc242961523 \h </w:instrText>
         </w:r>
         <w:r>
           <w:rPr>
@@ -1424,7 +1424,7 @@
             <w:noProof/>
             <w:webHidden/>
           </w:rPr>
-          <w:t>50</w:t>
+          <w:t>51</w:t>
         </w:r>
         <w:r>
           <w:rPr>
@@ -1445,7 +1445,7 @@
           <w:noProof/>
         </w:rPr>
       </w:pPr>
-      <w:hyperlink w:anchor="_Toc242961199" w:history="1">
+      <w:hyperlink w:anchor="_Toc242961524" w:history="1">
         <w:r>
           <w:rPr>
             <w:rStyle w:val="Hipervnculo"/>
@@ -1472,7 +1472,7 @@
             <w:noProof/>
             <w:webHidden/>
           </w:rPr>
-          <w:instrText xml:space="preserve"> PAGEREF _Toc242961199 \h </w:instrText>
+          <w:instrText xml:space="preserve"> PAGEREF _Toc242961524 \h </w:instrText>
         </w:r>
         <w:r>
           <w:rPr>
@@ -1492,7 +1492,7 @@
             <w:noProof/>
             <w:webHidden/>
           </w:rPr>
-          <w:t>50</w:t>
+          <w:t>51</w:t>
         </w:r>
         <w:r>
           <w:rPr>
@@ -1513,7 +1513,7 @@
           <w:noProof/>
         </w:rPr>
       </w:pPr>
-      <w:hyperlink w:anchor="_Toc242961200" w:history="1">
+      <w:hyperlink w:anchor="_Toc242961525" w:history="1">
         <w:r>
           <w:rPr>
             <w:rStyle w:val="Hipervnculo"/>
@@ -1540,7 +1540,7 @@
             <w:noProof/>
             <w:webHidden/>
           </w:rPr>
-          <w:instrText xml:space="preserve"> PAGEREF _Toc242961200 \h </w:instrText>
+          <w:instrText xml:space="preserve"> PAGEREF _Toc242961525 \h </w:instrText>
         </w:r>
         <w:r>
           <w:rPr>
@@ -1560,7 +1560,7 @@
             <w:noProof/>
             <w:webHidden/>
           </w:rPr>
-          <w:t>51</w:t>
+          <w:t>52</w:t>
         </w:r>
         <w:r>
           <w:rPr>
@@ -1581,7 +1581,7 @@
           <w:noProof/>
         </w:rPr>
       </w:pPr>
-      <w:hyperlink w:anchor="_Toc242961201" w:history="1">
+      <w:hyperlink w:anchor="_Toc242961526" w:history="1">
         <w:r>
           <w:rPr>
             <w:rStyle w:val="Hipervnculo"/>
@@ -1608,7 +1608,7 @@
             <w:noProof/>
             <w:webHidden/>
           </w:rPr>
-          <w:instrText xml:space="preserve"> PAGEREF _Toc242961201 \h </w:instrText>
+          <w:instrText xml:space="preserve"> PAGEREF _Toc242961526 \h </w:instrText>
         </w:r>
         <w:r>
           <w:rPr>
@@ -1628,7 +1628,7 @@
             <w:noProof/>
             <w:webHidden/>
           </w:rPr>
-          <w:t>51</w:t>
+          <w:t>52</w:t>
         </w:r>
         <w:r>
           <w:rPr>
@@ -1649,7 +1649,7 @@
           <w:noProof/>
         </w:rPr>
       </w:pPr>
-      <w:hyperlink w:anchor="_Toc242961202" w:history="1">
+      <w:hyperlink w:anchor="_Toc242961527" w:history="1">
         <w:r>
           <w:rPr>
             <w:rStyle w:val="Hipervnculo"/>
@@ -1676,7 +1676,7 @@
             <w:noProof/>
             <w:webHidden/>
           </w:rPr>
-          <w:instrText xml:space="preserve"> PAGEREF _Toc242961202 \h </w:instrText>
+          <w:instrText xml:space="preserve"> PAGEREF _Toc242961527 \h </w:instrText>
         </w:r>
         <w:r>
           <w:rPr>
@@ -1696,7 +1696,7 @@
             <w:noProof/>
             <w:webHidden/>
           </w:rPr>
-          <w:t>51</w:t>
+          <w:t>52</w:t>
         </w:r>
         <w:r>
           <w:rPr>
@@ -1717,7 +1717,7 @@
           <w:noProof/>
         </w:rPr>
       </w:pPr>
-      <w:hyperlink w:anchor="_Toc242961203" w:history="1">
+      <w:hyperlink w:anchor="_Toc242961528" w:history="1">
         <w:r>
           <w:rPr>
             <w:rStyle w:val="Hipervnculo"/>
@@ -1744,7 +1744,7 @@
             <w:noProof/>
             <w:webHidden/>
           </w:rPr>
-          <w:instrText xml:space="preserve"> PAGEREF _Toc242961203 \h </w:instrText>
+          <w:instrText xml:space="preserve"> PAGEREF _Toc242961528 \h </w:instrText>
         </w:r>
         <w:r>
           <w:rPr>
@@ -1764,7 +1764,7 @@
             <w:noProof/>
             <w:webHidden/>
           </w:rPr>
-          <w:t>52</w:t>
+          <w:t>53</w:t>
         </w:r>
         <w:r>
           <w:rPr>
@@ -1785,7 +1785,7 @@
           <w:noProof/>
         </w:rPr>
       </w:pPr>
-      <w:hyperlink w:anchor="_Toc242961204" w:history="1">
+      <w:hyperlink w:anchor="_Toc242961529" w:history="1">
         <w:r>
           <w:rPr>
             <w:rStyle w:val="Hipervnculo"/>
@@ -1812,7 +1812,7 @@
             <w:noProof/>
             <w:webHidden/>
           </w:rPr>
-          <w:instrText xml:space="preserve"> PAGEREF _Toc242961204 \h </w:instrText>
+          <w:instrText xml:space="preserve"> PAGEREF _Toc242961529 \h </w:instrText>
         </w:r>
         <w:r>
           <w:rPr>
@@ -1832,7 +1832,7 @@
             <w:noProof/>
             <w:webHidden/>
           </w:rPr>
-          <w:t>52</w:t>
+          <w:t>53</w:t>
         </w:r>
         <w:r>
           <w:rPr>
@@ -1853,7 +1853,7 @@
           <w:noProof/>
         </w:rPr>
       </w:pPr>
-      <w:hyperlink w:anchor="_Toc242961205" w:history="1">
+      <w:hyperlink w:anchor="_Toc242961530" w:history="1">
         <w:r>
           <w:rPr>
             <w:rStyle w:val="Hipervnculo"/>
@@ -1880,7 +1880,7 @@
             <w:noProof/>
             <w:webHidden/>
           </w:rPr>
-          <w:instrText xml:space="preserve"> PAGEREF _Toc242961205 \h </w:instrText>
+          <w:instrText xml:space="preserve"> PAGEREF _Toc242961530 \h </w:instrText>
         </w:r>
         <w:r>
           <w:rPr>
@@ -1900,7 +1900,7 @@
             <w:noProof/>
             <w:webHidden/>
           </w:rPr>
-          <w:t>53</w:t>
+          <w:t>54</w:t>
         </w:r>
         <w:r>
           <w:rPr>
@@ -1921,7 +1921,7 @@
           <w:noProof/>
         </w:rPr>
       </w:pPr>
-      <w:hyperlink w:anchor="_Toc242961206" w:history="1">
+      <w:hyperlink w:anchor="_Toc242961531" w:history="1">
         <w:r>
           <w:rPr>
             <w:rStyle w:val="Hipervnculo"/>
@@ -1948,7 +1948,7 @@
             <w:noProof/>
             <w:webHidden/>
           </w:rPr>
-          <w:instrText xml:space="preserve"> PAGEREF _Toc242961206 \h </w:instrText>
+          <w:instrText xml:space="preserve"> PAGEREF _Toc242961531 \h </w:instrText>
         </w:r>
         <w:r>
           <w:rPr>
@@ -1968,7 +1968,7 @@
             <w:noProof/>
             <w:webHidden/>
           </w:rPr>
-          <w:t>53</w:t>
+          <w:t>54</w:t>
         </w:r>
         <w:r>
           <w:rPr>
@@ -1989,7 +1989,7 @@
           <w:noProof/>
         </w:rPr>
       </w:pPr>
-      <w:hyperlink w:anchor="_Toc242961207" w:history="1">
+      <w:hyperlink w:anchor="_Toc242961532" w:history="1">
         <w:r>
           <w:rPr>
             <w:rStyle w:val="Hipervnculo"/>
@@ -2016,7 +2016,7 @@
             <w:noProof/>
             <w:webHidden/>
           </w:rPr>
-          <w:instrText xml:space="preserve"> PAGEREF _Toc242961207 \h </w:instrText>
+          <w:instrText xml:space="preserve"> PAGEREF _Toc242961532 \h </w:instrText>
         </w:r>
         <w:r>
           <w:rPr>
@@ -2036,7 +2036,7 @@
             <w:noProof/>
             <w:webHidden/>
           </w:rPr>
-          <w:t>54</w:t>
+          <w:t>55</w:t>
         </w:r>
         <w:r>
           <w:rPr>
@@ -2057,7 +2057,7 @@
           <w:noProof/>
         </w:rPr>
       </w:pPr>
-      <w:hyperlink w:anchor="_Toc242961208" w:history="1">
+      <w:hyperlink w:anchor="_Toc242961533" w:history="1">
         <w:r>
           <w:rPr>
             <w:rStyle w:val="Hipervnculo"/>
@@ -2084,7 +2084,7 @@
             <w:noProof/>
             <w:webHidden/>
           </w:rPr>
-          <w:instrText xml:space="preserve"> PAGEREF _Toc242961208 \h </w:instrText>
+          <w:instrText xml:space="preserve"> PAGEREF _Toc242961533 \h </w:instrText>
         </w:r>
         <w:r>
           <w:rPr>
@@ -2104,7 +2104,7 @@
             <w:noProof/>
             <w:webHidden/>
           </w:rPr>
-          <w:t>54</w:t>
+          <w:t>55</w:t>
         </w:r>
         <w:r>
           <w:rPr>
@@ -2125,7 +2125,7 @@
           <w:noProof/>
         </w:rPr>
       </w:pPr>
-      <w:hyperlink w:anchor="_Toc242961209" w:history="1">
+      <w:hyperlink w:anchor="_Toc242961534" w:history="1">
         <w:r>
           <w:rPr>
             <w:rStyle w:val="Hipervnculo"/>
@@ -2152,7 +2152,7 @@
             <w:noProof/>
             <w:webHidden/>
           </w:rPr>
-          <w:instrText xml:space="preserve"> PAGEREF _Toc242961209 \h </w:instrText>
+          <w:instrText xml:space="preserve"> PAGEREF _Toc242961534 \h </w:instrText>
         </w:r>
         <w:r>
           <w:rPr>
@@ -2172,7 +2172,7 @@
             <w:noProof/>
             <w:webHidden/>
           </w:rPr>
-          <w:t>55</w:t>
+          <w:t>56</w:t>
         </w:r>
         <w:r>
           <w:rPr>
@@ -2193,7 +2193,7 @@
           <w:noProof/>
         </w:rPr>
       </w:pPr>
-      <w:hyperlink w:anchor="_Toc242961210" w:history="1">
+      <w:hyperlink w:anchor="_Toc242961535" w:history="1">
         <w:r>
           <w:rPr>
             <w:rStyle w:val="Hipervnculo"/>
@@ -2220,7 +2220,7 @@
             <w:noProof/>
             <w:webHidden/>
           </w:rPr>
-          <w:instrText xml:space="preserve"> PAGEREF _Toc242961210 \h </w:instrText>
+          <w:instrText xml:space="preserve"> PAGEREF _Toc242961535 \h </w:instrText>
         </w:r>
         <w:r>
           <w:rPr>
@@ -2240,7 +2240,7 @@
             <w:noProof/>
             <w:webHidden/>
           </w:rPr>
-          <w:t>55</w:t>
+          <w:t>56</w:t>
         </w:r>
         <w:r>
           <w:rPr>
@@ -2261,7 +2261,7 @@
           <w:noProof/>
         </w:rPr>
       </w:pPr>
-      <w:hyperlink w:anchor="_Toc242961211" w:history="1">
+      <w:hyperlink w:anchor="_Toc242961536" w:history="1">
         <w:r>
           <w:rPr>
             <w:rStyle w:val="Hipervnculo"/>
@@ -2288,7 +2288,7 @@
             <w:noProof/>
             <w:webHidden/>
           </w:rPr>
-          <w:instrText xml:space="preserve"> PAGEREF _Toc242961211 \h </w:instrText>
+          <w:instrText xml:space="preserve"> PAGEREF _Toc242961536 \h </w:instrText>
         </w:r>
         <w:r>
           <w:rPr>
@@ -2308,7 +2308,7 @@
             <w:noProof/>
             <w:webHidden/>
           </w:rPr>
-          <w:t>56</w:t>
+          <w:t>57</w:t>
         </w:r>
         <w:r>
           <w:rPr>
@@ -2329,7 +2329,7 @@
           <w:noProof/>
         </w:rPr>
       </w:pPr>
-      <w:hyperlink w:anchor="_Toc242961212" w:history="1">
+      <w:hyperlink w:anchor="_Toc242961537" w:history="1">
         <w:r>
           <w:rPr>
             <w:rStyle w:val="Hipervnculo"/>
@@ -2356,7 +2356,7 @@
             <w:noProof/>
             <w:webHidden/>
           </w:rPr>
-          <w:instrText xml:space="preserve"> PAGEREF _Toc242961212 \h </w:instrText>
+          <w:instrText xml:space="preserve"> PAGEREF _Toc242961537 \h </w:instrText>
         </w:r>
         <w:r>
           <w:rPr>
@@ -2376,7 +2376,7 @@
             <w:noProof/>
             <w:webHidden/>
           </w:rPr>
-          <w:t>56</w:t>
+          <w:t>57</w:t>
         </w:r>
         <w:r>
           <w:rPr>
@@ -2397,7 +2397,7 @@
           <w:noProof/>
         </w:rPr>
       </w:pPr>
-      <w:hyperlink w:anchor="_Toc242961213" w:history="1">
+      <w:hyperlink w:anchor="_Toc242961538" w:history="1">
         <w:r>
           <w:rPr>
             <w:rStyle w:val="Hipervnculo"/>
@@ -2424,7 +2424,7 @@
             <w:noProof/>
             <w:webHidden/>
           </w:rPr>
-          <w:instrText xml:space="preserve"> PAGEREF _Toc242961213 \h </w:instrText>
+          <w:instrText xml:space="preserve"> PAGEREF _Toc242961538 \h </w:instrText>
         </w:r>
         <w:r>
           <w:rPr>
@@ -2444,7 +2444,7 @@
             <w:noProof/>
             <w:webHidden/>
           </w:rPr>
-          <w:t>57</w:t>
+          <w:t>58</w:t>
         </w:r>
         <w:r>
           <w:rPr>
@@ -2465,7 +2465,7 @@
           <w:noProof/>
         </w:rPr>
       </w:pPr>
-      <w:hyperlink w:anchor="_Toc242961214" w:history="1">
+      <w:hyperlink w:anchor="_Toc242961539" w:history="1">
         <w:r>
           <w:rPr>
             <w:rStyle w:val="Hipervnculo"/>
@@ -2492,7 +2492,7 @@
             <w:noProof/>
             <w:webHidden/>
           </w:rPr>
-          <w:instrText xml:space="preserve"> PAGEREF _Toc242961214 \h </w:instrText>
+          <w:instrText xml:space="preserve"> PAGEREF _Toc242961539 \h </w:instrText>
         </w:r>
         <w:r>
           <w:rPr>
@@ -2512,7 +2512,7 @@
             <w:noProof/>
             <w:webHidden/>
           </w:rPr>
-          <w:t>58</w:t>
+          <w:t>59</w:t>
         </w:r>
         <w:r>
           <w:rPr>
@@ -2533,7 +2533,7 @@
           <w:noProof/>
         </w:rPr>
       </w:pPr>
-      <w:hyperlink w:anchor="_Toc242961215" w:history="1">
+      <w:hyperlink w:anchor="_Toc242961540" w:history="1">
         <w:r>
           <w:rPr>
             <w:rStyle w:val="Hipervnculo"/>
@@ -2560,7 +2560,7 @@
             <w:noProof/>
             <w:webHidden/>
           </w:rPr>
-          <w:instrText xml:space="preserve"> PAGEREF _Toc242961215 \h </w:instrText>
+          <w:instrText xml:space="preserve"> PAGEREF _Toc242961540 \h </w:instrText>
         </w:r>
         <w:r>
           <w:rPr>
@@ -2580,7 +2580,7 @@
             <w:noProof/>
             <w:webHidden/>
           </w:rPr>
-          <w:t>59</w:t>
+          <w:t>60</w:t>
         </w:r>
         <w:r>
           <w:rPr>
@@ -2605,7 +2605,7 @@
       <w:pPr>
         <w:pStyle w:val="Ttulo1"/>
       </w:pPr>
-      <w:bookmarkStart w:id="0" w:name="_Toc242961179"/>
+      <w:bookmarkStart w:id="0" w:name="_Toc242961504"/>
       <w:r>
         <w:rPr>
           <w:rFonts w:ascii="Times New Roman" w:eastAsia="Times New Roman" w:hAnsi="Times New Roman" w:cs="Times New Roman"/>
@@ -2697,7 +2697,7 @@
       <w:pPr>
         <w:pStyle w:val="Ttulo1"/>
       </w:pPr>
-      <w:bookmarkStart w:id="1" w:name="_Toc242961180"/>
+      <w:bookmarkStart w:id="1" w:name="_Toc242961505"/>
       <w:r>
         <w:rPr>
           <w:rFonts w:ascii="Times New Roman" w:eastAsia="Times New Roman" w:hAnsi="Times New Roman" w:cs="Times New Roman"/>
@@ -2711,7 +2711,7 @@
       <w:pPr>
         <w:pStyle w:val="Ttulo2"/>
       </w:pPr>
-      <w:bookmarkStart w:id="2" w:name="_Toc242961181"/>
+      <w:bookmarkStart w:id="2" w:name="_Toc242961506"/>
       <w:r>
         <w:rPr>
           <w:rFonts w:ascii="Times New Roman" w:eastAsia="Times New Roman" w:hAnsi="Times New Roman" w:cs="Times New Roman"/>
@@ -2732,7 +2732,7 @@
       <w:pPr>
         <w:pStyle w:val="Ttulo2"/>
       </w:pPr>
-      <w:bookmarkStart w:id="3" w:name="_Toc242961182"/>
+      <w:bookmarkStart w:id="3" w:name="_Toc242961507"/>
       <w:r>
         <w:rPr>
           <w:rFonts w:ascii="Times New Roman" w:eastAsia="Times New Roman" w:hAnsi="Times New Roman" w:cs="Times New Roman"/>
@@ -2793,7 +2793,7 @@
       <w:pPr>
         <w:pStyle w:val="Ttulo1"/>
       </w:pPr>
-      <w:bookmarkStart w:id="4" w:name="_Toc242961183"/>
+      <w:bookmarkStart w:id="4" w:name="_Toc242961508"/>
       <w:r>
         <w:rPr>
           <w:rFonts w:ascii="Times New Roman" w:eastAsia="Times New Roman" w:hAnsi="Times New Roman" w:cs="Times New Roman"/>
@@ -3256,7 +3256,7 @@
       <w:pPr>
         <w:pStyle w:val="Ttulo1"/>
       </w:pPr>
-      <w:bookmarkStart w:id="5" w:name="_Toc242961184"/>
+      <w:bookmarkStart w:id="5" w:name="_Toc242961509"/>
       <w:r>
         <w:rPr>
           <w:rFonts w:ascii="Times New Roman" w:eastAsia="Times New Roman" w:hAnsi="Times New Roman" w:cs="Times New Roman"/>
@@ -3288,7 +3288,7 @@
       <w:pPr>
         <w:pStyle w:val="Ttulo2"/>
       </w:pPr>
-      <w:bookmarkStart w:id="6" w:name="_Toc242961185"/>
+      <w:bookmarkStart w:id="6" w:name="_Toc242961510"/>
       <w:r>
         <w:rPr>
           <w:rFonts w:ascii="Times New Roman" w:eastAsia="Times New Roman" w:hAnsi="Times New Roman" w:cs="Times New Roman"/>
@@ -3377,7 +3377,7 @@
           <w:noProof/>
         </w:rPr>
         <w:drawing>
-          <wp:inline distT="0" distB="0" distL="0" distR="0" wp14:anchorId="74C7F4CA" wp14:editId="3606E517">
+          <wp:inline distT="0" distB="0" distL="0" distR="0" wp14:anchorId="266E6F52" wp14:editId="75B15535">
             <wp:extent cx="5943600" cy="3075618"/>
             <wp:effectExtent l="0" t="0" r="0" b="0"/>
             <wp:docPr id="1" name="Picture 1"/>
@@ -3491,7 +3491,7 @@
           <w:noProof/>
         </w:rPr>
         <w:drawing>
-          <wp:inline distT="0" distB="0" distL="0" distR="0" wp14:anchorId="418F7900" wp14:editId="3821C014">
+          <wp:inline distT="0" distB="0" distL="0" distR="0" wp14:anchorId="2F1EC9D7" wp14:editId="4B32130C">
             <wp:extent cx="5943600" cy="3415004"/>
             <wp:effectExtent l="0" t="0" r="0" b="0"/>
             <wp:docPr id="2" name="Picture 2"/>
@@ -3553,7 +3553,7 @@
       <w:pPr>
         <w:pStyle w:val="Ttulo2"/>
       </w:pPr>
-      <w:bookmarkStart w:id="7" w:name="_Toc242961186"/>
+      <w:bookmarkStart w:id="7" w:name="_Toc242961511"/>
       <w:r>
         <w:rPr>
           <w:rFonts w:ascii="Times New Roman" w:eastAsia="Times New Roman" w:hAnsi="Times New Roman" w:cs="Times New Roman"/>
@@ -3978,7 +3978,7 @@
           <w:noProof/>
         </w:rPr>
         <w:drawing>
-          <wp:inline distT="0" distB="0" distL="0" distR="0" wp14:anchorId="01D29942" wp14:editId="074E323A">
+          <wp:inline distT="0" distB="0" distL="0" distR="0" wp14:anchorId="5B119A4F" wp14:editId="4D59B891">
             <wp:extent cx="5943600" cy="3116766"/>
             <wp:effectExtent l="0" t="0" r="0" b="0"/>
             <wp:docPr id="3" name="Picture 3"/>
@@ -4075,7 +4075,7 @@
       <w:pPr>
         <w:pStyle w:val="Ttulo2"/>
       </w:pPr>
-      <w:bookmarkStart w:id="8" w:name="_Toc242961187"/>
+      <w:bookmarkStart w:id="8" w:name="_Toc242961512"/>
       <w:r>
         <w:rPr>
           <w:rFonts w:ascii="Times New Roman" w:eastAsia="Times New Roman" w:hAnsi="Times New Roman" w:cs="Times New Roman"/>
@@ -4257,7 +4257,7 @@
           <w:noProof/>
         </w:rPr>
         <w:drawing>
-          <wp:inline distT="0" distB="0" distL="0" distR="0" wp14:anchorId="5DE985DB" wp14:editId="62C10886">
+          <wp:inline distT="0" distB="0" distL="0" distR="0" wp14:anchorId="060A73C9" wp14:editId="5A08A914">
             <wp:extent cx="5943600" cy="3241210"/>
             <wp:effectExtent l="0" t="0" r="0" b="0"/>
             <wp:docPr id="4" name="Picture 4"/>
@@ -4483,7 +4483,7 @@
           <w:noProof/>
         </w:rPr>
         <w:drawing>
-          <wp:inline distT="0" distB="0" distL="0" distR="0" wp14:anchorId="2270F5C4" wp14:editId="6291280F">
+          <wp:inline distT="0" distB="0" distL="0" distR="0" wp14:anchorId="194B53E9" wp14:editId="79DEDDD8">
             <wp:extent cx="5943600" cy="2613842"/>
             <wp:effectExtent l="0" t="0" r="0" b="0"/>
             <wp:docPr id="5" name="Picture 5"/>
@@ -4746,7 +4746,7 @@
           <w:noProof/>
         </w:rPr>
         <w:drawing>
-          <wp:inline distT="0" distB="0" distL="0" distR="0" wp14:anchorId="75BAA8B4" wp14:editId="14E6F8C1">
+          <wp:inline distT="0" distB="0" distL="0" distR="0" wp14:anchorId="75F19D41" wp14:editId="512AB522">
             <wp:extent cx="5943600" cy="3686483"/>
             <wp:effectExtent l="0" t="0" r="0" b="0"/>
             <wp:docPr id="6" name="Picture 6"/>
@@ -4977,7 +4977,7 @@
       <w:pPr>
         <w:pStyle w:val="Ttulo2"/>
       </w:pPr>
-      <w:bookmarkStart w:id="9" w:name="_Toc242961188"/>
+      <w:bookmarkStart w:id="9" w:name="_Toc242961513"/>
       <w:r>
         <w:rPr>
           <w:rFonts w:ascii="Times New Roman" w:eastAsia="Times New Roman" w:hAnsi="Times New Roman" w:cs="Times New Roman"/>
@@ -5618,7 +5618,7 @@
           <w:noProof/>
         </w:rPr>
         <w:drawing>
-          <wp:inline distT="0" distB="0" distL="0" distR="0" wp14:anchorId="7BE1C539" wp14:editId="1F5815FE">
+          <wp:inline distT="0" distB="0" distL="0" distR="0" wp14:anchorId="6E73B031" wp14:editId="673B35A5">
             <wp:extent cx="5943600" cy="3915988"/>
             <wp:effectExtent l="0" t="0" r="0" b="0"/>
             <wp:docPr id="7" name="Picture 7"/>
@@ -7173,7 +7173,7 @@
           <w:noProof/>
         </w:rPr>
         <w:drawing>
-          <wp:inline distT="0" distB="0" distL="0" distR="0" wp14:anchorId="11507589" wp14:editId="56B9CE74">
+          <wp:inline distT="0" distB="0" distL="0" distR="0" wp14:anchorId="6585DFDE" wp14:editId="5BEA3B30">
             <wp:extent cx="5943600" cy="3915988"/>
             <wp:effectExtent l="0" t="0" r="0" b="0"/>
             <wp:docPr id="8" name="Picture 8"/>
@@ -7255,7 +7255,7 @@
           <w:noProof/>
         </w:rPr>
         <w:drawing>
-          <wp:inline distT="0" distB="0" distL="0" distR="0" wp14:anchorId="31320F22" wp14:editId="687B60C5">
+          <wp:inline distT="0" distB="0" distL="0" distR="0" wp14:anchorId="43ED7DB9" wp14:editId="08FD0185">
             <wp:extent cx="5943600" cy="3915988"/>
             <wp:effectExtent l="0" t="0" r="0" b="0"/>
             <wp:docPr id="9" name="Picture 9"/>
@@ -7337,7 +7337,7 @@
           <w:noProof/>
         </w:rPr>
         <w:drawing>
-          <wp:inline distT="0" distB="0" distL="0" distR="0" wp14:anchorId="603C421A" wp14:editId="02C0C5CD">
+          <wp:inline distT="0" distB="0" distL="0" distR="0" wp14:anchorId="6D300097" wp14:editId="65938050">
             <wp:extent cx="5943600" cy="3915988"/>
             <wp:effectExtent l="0" t="0" r="0" b="0"/>
             <wp:docPr id="10" name="Picture 10"/>
@@ -8763,7 +8763,7 @@
       <w:pPr>
         <w:pStyle w:val="Ttulo2"/>
       </w:pPr>
-      <w:bookmarkStart w:id="10" w:name="_Toc242961189"/>
+      <w:bookmarkStart w:id="10" w:name="_Toc242961514"/>
       <w:r>
         <w:rPr>
           <w:rFonts w:ascii="Times New Roman" w:eastAsia="Times New Roman" w:hAnsi="Times New Roman" w:cs="Times New Roman"/>
@@ -8788,7 +8788,17 @@
         <w:ind w:firstLine="720"/>
       </w:pPr>
       <w:r>
-        <w:t xml:space="preserve">Diseñé en Figma un wireframe de EventFlow intencionalmente mal hecho, en escala de grises, con dos pantallas: </w:t>
+        <w:t xml:space="preserve">El wireframe intencionalmente mal hecho parte del </w:t>
+      </w:r>
+      <w:r>
+        <w:rPr>
+          <w:rFonts w:ascii="Courier New" w:eastAsia="Courier New" w:hAnsi="Courier New" w:cs="Courier New"/>
+          <w:sz w:val="22"/>
+        </w:rPr>
+        <w:t>index.html</w:t>
+      </w:r>
+      <w:r>
+        <w:t xml:space="preserve"> de la guía, con el mismo contenido: el título “Bienvenido a EventFlow”, el subtítulo, los eventos “Concierto de Rock” (30 de diciembre) y “Feria de Tecnología” (15 de enero) y el pie “© 2025 EventFlow”. A propósito le añadí las tres fallas del ejemplo de la Parte A de la guía. La pantalla </w:t>
       </w:r>
       <w:r>
         <w:rPr>
@@ -8797,7 +8807,7 @@
         <w:t>Eventos</w:t>
       </w:r>
       <w:r>
-        <w:t xml:space="preserve"> y </w:t>
+        <w:t xml:space="preserve"> usa un botón verde que dice “Comprar”. La pantalla </w:t>
       </w:r>
       <w:r>
         <w:rPr>
@@ -8806,7 +8816,17 @@
         <w:t>Detalle</w:t>
       </w:r>
       <w:r>
-        <w:t xml:space="preserve"> (Figuras 19 y 20). Los números en amarillo marcan las violaciones.</w:t>
+        <w:t xml:space="preserve"> agrega un campo de texto de cantidad que acepta “dos” y un botón azul redondeado que dice “Adquirir”. En ninguna de las dos, al hacer clic, hay otra respuesta que el </w:t>
+      </w:r>
+      <w:r>
+        <w:rPr>
+          <w:rFonts w:ascii="Courier New" w:eastAsia="Courier New" w:hAnsi="Courier New" w:cs="Courier New"/>
+          <w:sz w:val="22"/>
+        </w:rPr>
+        <w:t>alert()</w:t>
+      </w:r>
+      <w:r>
+        <w:t xml:space="preserve"> original (Figuras 19 y 20). Los números en amarillo marcan las violaciones.</w:t>
       </w:r>
     </w:p>
     <w:p>
@@ -8843,7 +8863,7 @@
           <w:noProof/>
         </w:rPr>
         <w:drawing>
-          <wp:inline distT="0" distB="0" distL="0" distR="0" wp14:anchorId="38710198" wp14:editId="6256FFEE">
+          <wp:inline distT="0" distB="0" distL="0" distR="0" wp14:anchorId="66AE66C9" wp14:editId="4BAA122C">
             <wp:extent cx="5943600" cy="3480878"/>
             <wp:effectExtent l="0" t="0" r="0" b="0"/>
             <wp:docPr id="11" name="Picture 11"/>
@@ -8993,7 +9013,7 @@
               <w:rPr>
                 <w:sz w:val="22"/>
               </w:rPr>
-              <w:t xml:space="preserve">Frame “EventFlow — Malo” en Figma con las pantallas Eventos y Detalle y los marcadores 1–3 </w:t>
+              <w:t xml:space="preserve">Editor de Figma con el archivo “EventFlow — Wireframes (Taller Arquitectura)”: frame “EventFlow — Malo” con las pantallas Eventos y Detalle y los marcadores 1–3 </w:t>
             </w:r>
           </w:p>
           <w:p>
@@ -9177,7 +9197,7 @@
         <w:ind w:firstLine="720"/>
       </w:pPr>
       <w:r>
-        <w:t>A partir de la auditoría construí el wireframe corregido (Figuras 21 y 22): botones consistentes, input numérico con límites y total calculado, una tercera pantalla con el estado “Reservando tu entrada…” (spinner, barra de progreso, temporizador de 10 minutos y botón deshabilitado) y la salida de emergencia “Cancelar reserva”.</w:t>
+        <w:t>A partir de la auditoría construí el wireframe corregido, con el mismo contenido de la guía (Figuras 21 y 22). Incluye un encabezado con migas de pan, el mismo botón “Comprar entrada” en todas las pantallas y un selector numérico “– 2 +” limitado a entre 1 y 6 entradas. También agrega el botón “Volver a eventos” y una tercera pantalla con el estado “Reservando tu entrada…” (spinner, barra de progreso, temporizador de 10 minutos y botón deshabilitado) y la salida de emergencia “Cancelar reserva”.</w:t>
       </w:r>
     </w:p>
     <w:p>
@@ -9188,6 +9208,7 @@
         <w:rPr>
           <w:b/>
         </w:rPr>
+        <w:lastRenderedPageBreak/>
         <w:t>Figura 21</w:t>
       </w:r>
     </w:p>
@@ -9213,7 +9234,7 @@
           <w:noProof/>
         </w:rPr>
         <w:drawing>
-          <wp:inline distT="0" distB="0" distL="0" distR="0" wp14:anchorId="3EA54AE4" wp14:editId="6636E936">
+          <wp:inline distT="0" distB="0" distL="0" distR="0" wp14:anchorId="56880411" wp14:editId="3B10D119">
             <wp:extent cx="5943600" cy="3480878"/>
             <wp:effectExtent l="0" t="0" r="0" b="0"/>
             <wp:docPr id="12" name="Picture 12"/>
@@ -9363,7 +9384,7 @@
               <w:rPr>
                 <w:sz w:val="22"/>
               </w:rPr>
-              <w:t xml:space="preserve">Frame “EventFlow — Corregido” en Figma con las 3 pantallas (Eventos, Detalle, Reservando…) </w:t>
+              <w:t xml:space="preserve">Editor de Figma con el archivo “EventFlow — Wireframes (Taller Arquitectura)”: frame “EventFlow — Corregido” con las 3 pantallas (Eventos, Detalle, Reservando…) </w:t>
             </w:r>
           </w:p>
           <w:p>
@@ -9395,6 +9416,7 @@
         <w:rPr>
           <w:rFonts w:ascii="Times New Roman" w:eastAsia="Times New Roman" w:hAnsi="Times New Roman" w:cs="Times New Roman"/>
         </w:rPr>
+        <w:lastRenderedPageBreak/>
         <w:t>Simulación 1: El ATAM</w:t>
       </w:r>
     </w:p>
@@ -9464,7 +9486,7 @@
           <w:noProof/>
         </w:rPr>
         <w:drawing>
-          <wp:inline distT="0" distB="0" distL="0" distR="0" wp14:anchorId="639DBB65" wp14:editId="352AF86B">
+          <wp:inline distT="0" distB="0" distL="0" distR="0" wp14:anchorId="0F328C85" wp14:editId="21457507">
             <wp:extent cx="5943600" cy="4335175"/>
             <wp:effectExtent l="0" t="0" r="0" b="0"/>
             <wp:docPr id="13" name="Picture 13"/>
@@ -10143,7 +10165,7 @@
           <w:noProof/>
         </w:rPr>
         <w:drawing>
-          <wp:inline distT="0" distB="0" distL="0" distR="0" wp14:anchorId="4C88FBD5" wp14:editId="3E3207D9">
+          <wp:inline distT="0" distB="0" distL="0" distR="0" wp14:anchorId="00A7558E" wp14:editId="2E89CB0E">
             <wp:extent cx="5943600" cy="2795863"/>
             <wp:effectExtent l="0" t="0" r="0" b="0"/>
             <wp:docPr id="14" name="Picture 14"/>
@@ -10276,7 +10298,7 @@
       <w:pPr>
         <w:pStyle w:val="Ttulo1"/>
       </w:pPr>
-      <w:bookmarkStart w:id="11" w:name="_Toc242961190"/>
+      <w:bookmarkStart w:id="11" w:name="_Toc242961515"/>
       <w:r>
         <w:rPr>
           <w:rFonts w:ascii="Times New Roman" w:eastAsia="Times New Roman" w:hAnsi="Times New Roman" w:cs="Times New Roman"/>
@@ -10327,7 +10349,7 @@
           <w:noProof/>
         </w:rPr>
         <w:drawing>
-          <wp:inline distT="0" distB="0" distL="0" distR="0" wp14:anchorId="2063F822" wp14:editId="36330432">
+          <wp:inline distT="0" distB="0" distL="0" distR="0" wp14:anchorId="773FA0D7" wp14:editId="5F0A4BC1">
             <wp:extent cx="5943600" cy="3463740"/>
             <wp:effectExtent l="0" t="0" r="0" b="0"/>
             <wp:docPr id="15" name="Picture 15"/>
@@ -10389,7 +10411,7 @@
       <w:pPr>
         <w:pStyle w:val="Ttulo2"/>
       </w:pPr>
-      <w:bookmarkStart w:id="12" w:name="_Toc242961191"/>
+      <w:bookmarkStart w:id="12" w:name="_Toc242961516"/>
       <w:r>
         <w:rPr>
           <w:rFonts w:ascii="Times New Roman" w:eastAsia="Times New Roman" w:hAnsi="Times New Roman" w:cs="Times New Roman"/>
@@ -11039,7 +11061,7 @@
           <w:noProof/>
         </w:rPr>
         <w:drawing>
-          <wp:inline distT="0" distB="0" distL="0" distR="0" wp14:anchorId="5E34D5D1" wp14:editId="2BFBA318">
+          <wp:inline distT="0" distB="0" distL="0" distR="0" wp14:anchorId="29092613" wp14:editId="5F065D26">
             <wp:extent cx="5943600" cy="3206877"/>
             <wp:effectExtent l="0" t="0" r="0" b="0"/>
             <wp:docPr id="16" name="Picture 16"/>
@@ -11674,7 +11696,7 @@
       <w:pPr>
         <w:pStyle w:val="Ttulo2"/>
       </w:pPr>
-      <w:bookmarkStart w:id="13" w:name="_Toc242961192"/>
+      <w:bookmarkStart w:id="13" w:name="_Toc242961517"/>
       <w:r>
         <w:rPr>
           <w:rFonts w:ascii="Times New Roman" w:eastAsia="Times New Roman" w:hAnsi="Times New Roman" w:cs="Times New Roman"/>
@@ -12195,7 +12217,7 @@
       <w:pPr>
         <w:pStyle w:val="Ttulo2"/>
       </w:pPr>
-      <w:bookmarkStart w:id="14" w:name="_Toc242961193"/>
+      <w:bookmarkStart w:id="14" w:name="_Toc242961518"/>
       <w:r>
         <w:rPr>
           <w:rFonts w:ascii="Times New Roman" w:eastAsia="Times New Roman" w:hAnsi="Times New Roman" w:cs="Times New Roman"/>
@@ -13234,7 +13256,7 @@
       <w:pPr>
         <w:pStyle w:val="Ttulo1"/>
       </w:pPr>
-      <w:bookmarkStart w:id="15" w:name="_Toc242961194"/>
+      <w:bookmarkStart w:id="15" w:name="_Toc242961519"/>
       <w:r>
         <w:rPr>
           <w:rFonts w:ascii="Times New Roman" w:eastAsia="Times New Roman" w:hAnsi="Times New Roman" w:cs="Times New Roman"/>
@@ -13248,7 +13270,7 @@
       <w:pPr>
         <w:pStyle w:val="Ttulo2"/>
       </w:pPr>
-      <w:bookmarkStart w:id="16" w:name="_Toc242961195"/>
+      <w:bookmarkStart w:id="16" w:name="_Toc242961520"/>
       <w:r>
         <w:rPr>
           <w:rFonts w:ascii="Times New Roman" w:eastAsia="Times New Roman" w:hAnsi="Times New Roman" w:cs="Times New Roman"/>
@@ -13278,7 +13300,7 @@
       <w:pPr>
         <w:pStyle w:val="Ttulo2"/>
       </w:pPr>
-      <w:bookmarkStart w:id="17" w:name="_Toc242961196"/>
+      <w:bookmarkStart w:id="17" w:name="_Toc242961521"/>
       <w:r>
         <w:rPr>
           <w:rFonts w:ascii="Times New Roman" w:eastAsia="Times New Roman" w:hAnsi="Times New Roman" w:cs="Times New Roman"/>
@@ -13430,7 +13452,7 @@
       <w:pPr>
         <w:pStyle w:val="Ttulo2"/>
       </w:pPr>
-      <w:bookmarkStart w:id="18" w:name="_Toc242961197"/>
+      <w:bookmarkStart w:id="18" w:name="_Toc242961522"/>
       <w:r>
         <w:rPr>
           <w:rFonts w:ascii="Times New Roman" w:eastAsia="Times New Roman" w:hAnsi="Times New Roman" w:cs="Times New Roman"/>
@@ -13549,7 +13571,7 @@
       <w:pPr>
         <w:pStyle w:val="Ttulo2"/>
       </w:pPr>
-      <w:bookmarkStart w:id="19" w:name="_Toc242961198"/>
+      <w:bookmarkStart w:id="19" w:name="_Toc242961523"/>
       <w:r>
         <w:rPr>
           <w:rFonts w:ascii="Times New Roman" w:eastAsia="Times New Roman" w:hAnsi="Times New Roman" w:cs="Times New Roman"/>
@@ -13663,7 +13685,7 @@
       <w:pPr>
         <w:pStyle w:val="Ttulo2"/>
       </w:pPr>
-      <w:bookmarkStart w:id="20" w:name="_Toc242961199"/>
+      <w:bookmarkStart w:id="20" w:name="_Toc242961524"/>
       <w:r>
         <w:rPr>
           <w:rFonts w:ascii="Times New Roman" w:eastAsia="Times New Roman" w:hAnsi="Times New Roman" w:cs="Times New Roman"/>
@@ -13712,7 +13734,7 @@
       <w:pPr>
         <w:pStyle w:val="Ttulo2"/>
       </w:pPr>
-      <w:bookmarkStart w:id="21" w:name="_Toc242961200"/>
+      <w:bookmarkStart w:id="21" w:name="_Toc242961525"/>
       <w:r>
         <w:rPr>
           <w:rFonts w:ascii="Times New Roman" w:eastAsia="Times New Roman" w:hAnsi="Times New Roman" w:cs="Times New Roman"/>
@@ -13761,7 +13783,7 @@
       <w:pPr>
         <w:pStyle w:val="Ttulo2"/>
       </w:pPr>
-      <w:bookmarkStart w:id="22" w:name="_Toc242961201"/>
+      <w:bookmarkStart w:id="22" w:name="_Toc242961526"/>
       <w:r>
         <w:rPr>
           <w:rFonts w:ascii="Times New Roman" w:eastAsia="Times New Roman" w:hAnsi="Times New Roman" w:cs="Times New Roman"/>
@@ -13880,7 +13902,7 @@
       <w:pPr>
         <w:pStyle w:val="Ttulo2"/>
       </w:pPr>
-      <w:bookmarkStart w:id="23" w:name="_Toc242961202"/>
+      <w:bookmarkStart w:id="23" w:name="_Toc242961527"/>
       <w:r>
         <w:rPr>
           <w:rFonts w:ascii="Times New Roman" w:eastAsia="Times New Roman" w:hAnsi="Times New Roman" w:cs="Times New Roman"/>
@@ -13976,7 +13998,7 @@
       <w:pPr>
         <w:pStyle w:val="Ttulo2"/>
       </w:pPr>
-      <w:bookmarkStart w:id="24" w:name="_Toc242961203"/>
+      <w:bookmarkStart w:id="24" w:name="_Toc242961528"/>
       <w:r>
         <w:rPr>
           <w:rFonts w:ascii="Times New Roman" w:eastAsia="Times New Roman" w:hAnsi="Times New Roman" w:cs="Times New Roman"/>
@@ -14006,7 +14028,7 @@
       <w:pPr>
         <w:pStyle w:val="Ttulo2"/>
       </w:pPr>
-      <w:bookmarkStart w:id="25" w:name="_Toc242961204"/>
+      <w:bookmarkStart w:id="25" w:name="_Toc242961529"/>
       <w:r>
         <w:rPr>
           <w:rFonts w:ascii="Times New Roman" w:eastAsia="Times New Roman" w:hAnsi="Times New Roman" w:cs="Times New Roman"/>
@@ -14058,7 +14080,7 @@
       <w:pPr>
         <w:pStyle w:val="Ttulo2"/>
       </w:pPr>
-      <w:bookmarkStart w:id="26" w:name="_Toc242961205"/>
+      <w:bookmarkStart w:id="26" w:name="_Toc242961530"/>
       <w:r>
         <w:rPr>
           <w:rFonts w:ascii="Times New Roman" w:eastAsia="Times New Roman" w:hAnsi="Times New Roman" w:cs="Times New Roman"/>
@@ -14281,7 +14303,7 @@
       <w:pPr>
         <w:pStyle w:val="Ttulo2"/>
       </w:pPr>
-      <w:bookmarkStart w:id="27" w:name="_Toc242961206"/>
+      <w:bookmarkStart w:id="27" w:name="_Toc242961531"/>
       <w:r>
         <w:rPr>
           <w:rFonts w:ascii="Times New Roman" w:eastAsia="Times New Roman" w:hAnsi="Times New Roman" w:cs="Times New Roman"/>
@@ -14323,7 +14345,7 @@
       <w:pPr>
         <w:pStyle w:val="Ttulo2"/>
       </w:pPr>
-      <w:bookmarkStart w:id="28" w:name="_Toc242961207"/>
+      <w:bookmarkStart w:id="28" w:name="_Toc242961532"/>
       <w:r>
         <w:rPr>
           <w:rFonts w:ascii="Times New Roman" w:eastAsia="Times New Roman" w:hAnsi="Times New Roman" w:cs="Times New Roman"/>
@@ -14658,7 +14680,7 @@
       <w:pPr>
         <w:pStyle w:val="Ttulo2"/>
       </w:pPr>
-      <w:bookmarkStart w:id="29" w:name="_Toc242961208"/>
+      <w:bookmarkStart w:id="29" w:name="_Toc242961533"/>
       <w:r>
         <w:rPr>
           <w:rFonts w:ascii="Times New Roman" w:eastAsia="Times New Roman" w:hAnsi="Times New Roman" w:cs="Times New Roman"/>
@@ -14758,7 +14780,7 @@
       <w:pPr>
         <w:pStyle w:val="Ttulo2"/>
       </w:pPr>
-      <w:bookmarkStart w:id="30" w:name="_Toc242961209"/>
+      <w:bookmarkStart w:id="30" w:name="_Toc242961534"/>
       <w:r>
         <w:rPr>
           <w:rFonts w:ascii="Times New Roman" w:eastAsia="Times New Roman" w:hAnsi="Times New Roman" w:cs="Times New Roman"/>
@@ -14797,7 +14819,7 @@
       <w:pPr>
         <w:pStyle w:val="Ttulo2"/>
       </w:pPr>
-      <w:bookmarkStart w:id="31" w:name="_Toc242961210"/>
+      <w:bookmarkStart w:id="31" w:name="_Toc242961535"/>
       <w:r>
         <w:rPr>
           <w:rFonts w:ascii="Times New Roman" w:eastAsia="Times New Roman" w:hAnsi="Times New Roman" w:cs="Times New Roman"/>
@@ -14854,7 +14876,7 @@
       <w:pPr>
         <w:pStyle w:val="Ttulo2"/>
       </w:pPr>
-      <w:bookmarkStart w:id="32" w:name="_Toc242961211"/>
+      <w:bookmarkStart w:id="32" w:name="_Toc242961536"/>
       <w:r>
         <w:rPr>
           <w:rFonts w:ascii="Times New Roman" w:eastAsia="Times New Roman" w:hAnsi="Times New Roman" w:cs="Times New Roman"/>
@@ -14895,7 +14917,7 @@
       <w:pPr>
         <w:pStyle w:val="Ttulo2"/>
       </w:pPr>
-      <w:bookmarkStart w:id="33" w:name="_Toc242961212"/>
+      <w:bookmarkStart w:id="33" w:name="_Toc242961537"/>
       <w:r>
         <w:rPr>
           <w:rFonts w:ascii="Times New Roman" w:eastAsia="Times New Roman" w:hAnsi="Times New Roman" w:cs="Times New Roman"/>
@@ -14999,7 +15021,7 @@
       <w:pPr>
         <w:pStyle w:val="Ttulo2"/>
       </w:pPr>
-      <w:bookmarkStart w:id="34" w:name="_Toc242961213"/>
+      <w:bookmarkStart w:id="34" w:name="_Toc242961538"/>
       <w:r>
         <w:rPr>
           <w:rFonts w:ascii="Times New Roman" w:eastAsia="Times New Roman" w:hAnsi="Times New Roman" w:cs="Times New Roman"/>
@@ -15046,7 +15068,7 @@
       <w:pPr>
         <w:pStyle w:val="Ttulo1"/>
       </w:pPr>
-      <w:bookmarkStart w:id="35" w:name="_Toc242961214"/>
+      <w:bookmarkStart w:id="35" w:name="_Toc242961539"/>
       <w:r>
         <w:rPr>
           <w:rFonts w:ascii="Times New Roman" w:eastAsia="Times New Roman" w:hAnsi="Times New Roman" w:cs="Times New Roman"/>
@@ -15141,7 +15163,7 @@
       <w:pPr>
         <w:pStyle w:val="Ttulo1"/>
       </w:pPr>
-      <w:bookmarkStart w:id="36" w:name="_Toc242961215"/>
+      <w:bookmarkStart w:id="36" w:name="_Toc242961540"/>
       <w:r>
         <w:rPr>
           <w:rFonts w:ascii="Times New Roman" w:eastAsia="Times New Roman" w:hAnsi="Times New Roman" w:cs="Times New Roman"/>
@@ -15718,31 +15740,31 @@
       </w:rPr>
     </w:lvl>
   </w:abstractNum>
-  <w:num w:numId="1" w16cid:durableId="1552572174">
+  <w:num w:numId="1" w16cid:durableId="1185945281">
     <w:abstractNumId w:val="8"/>
   </w:num>
-  <w:num w:numId="2" w16cid:durableId="211963529">
+  <w:num w:numId="2" w16cid:durableId="409352357">
     <w:abstractNumId w:val="6"/>
   </w:num>
-  <w:num w:numId="3" w16cid:durableId="1969317596">
+  <w:num w:numId="3" w16cid:durableId="582106373">
     <w:abstractNumId w:val="5"/>
   </w:num>
-  <w:num w:numId="4" w16cid:durableId="1760442555">
+  <w:num w:numId="4" w16cid:durableId="1998529827">
     <w:abstractNumId w:val="4"/>
   </w:num>
-  <w:num w:numId="5" w16cid:durableId="368459045">
+  <w:num w:numId="5" w16cid:durableId="1879510372">
     <w:abstractNumId w:val="7"/>
   </w:num>
-  <w:num w:numId="6" w16cid:durableId="45225963">
+  <w:num w:numId="6" w16cid:durableId="928538408">
     <w:abstractNumId w:val="3"/>
   </w:num>
-  <w:num w:numId="7" w16cid:durableId="1699354616">
+  <w:num w:numId="7" w16cid:durableId="1085564903">
     <w:abstractNumId w:val="2"/>
   </w:num>
-  <w:num w:numId="8" w16cid:durableId="1459028535">
+  <w:num w:numId="8" w16cid:durableId="1042901267">
     <w:abstractNumId w:val="1"/>
   </w:num>
-  <w:num w:numId="9" w16cid:durableId="1988850958">
+  <w:num w:numId="9" w16cid:durableId="2011829788">
     <w:abstractNumId w:val="0"/>
   </w:num>
 </w:numbering>
@@ -27170,7 +27192,7 @@
     <w:autoRedefine/>
     <w:uiPriority w:val="39"/>
     <w:unhideWhenUsed/>
-    <w:rsid w:val="00BC2398"/>
+    <w:rsid w:val="00A6183E"/>
     <w:pPr>
       <w:spacing w:after="100"/>
     </w:pPr>
@@ -27182,7 +27204,7 @@
     <w:autoRedefine/>
     <w:uiPriority w:val="39"/>
     <w:unhideWhenUsed/>
-    <w:rsid w:val="00BC2398"/>
+    <w:rsid w:val="00A6183E"/>
     <w:pPr>
       <w:spacing w:after="100"/>
       <w:ind w:left="240"/>
@@ -27193,7 +27215,7 @@
     <w:basedOn w:val="Fuentedeprrafopredeter"/>
     <w:uiPriority w:val="99"/>
     <w:unhideWhenUsed/>
-    <w:rsid w:val="00BC2398"/>
+    <w:rsid w:val="00A6183E"/>
     <w:rPr>
       <w:color w:val="0000FF" w:themeColor="hyperlink"/>
       <w:u w:val="single"/>

</xml_diff>